<commit_message>
Update El análisis lógico del esquema para el ejercicio D.docx
</commit_message>
<xml_diff>
--- a/Database 1/TP 02/El análisis lógico del esquema para el ejercicio D.docx
+++ b/Database 1/TP 02/El análisis lógico del esquema para el ejercicio D.docx
@@ -2701,6 +2701,1806 @@
         <w:t>1:N.</w:t>
       </w:r>
       <w:proofErr w:type="gramEnd"/>
+    </w:p>
+    <w:p>
+      <w:pPr>
+        <w:spacing w:before="100" w:beforeAutospacing="1" w:after="100" w:afterAutospacing="1" w:line="240" w:lineRule="auto"/>
+        <w:outlineLvl w:val="2"/>
+        <w:rPr>
+          <w:rFonts w:ascii="Times New Roman" w:eastAsia="Times New Roman" w:hAnsi="Times New Roman" w:cs="Times New Roman"/>
+          <w:b/>
+          <w:bCs/>
+          <w:sz w:val="27"/>
+          <w:szCs w:val="27"/>
+          <w:lang w:eastAsia="es-AR"/>
+        </w:rPr>
+      </w:pPr>
+      <w:r>
+        <w:rPr>
+          <w:rFonts w:ascii="Times New Roman" w:eastAsia="Times New Roman" w:hAnsi="Times New Roman" w:cs="Times New Roman"/>
+          <w:b/>
+          <w:bCs/>
+          <w:sz w:val="27"/>
+          <w:szCs w:val="27"/>
+          <w:lang w:eastAsia="es-AR"/>
+        </w:rPr>
+        <w:t>2° Objetivo: Seguimiento de Operaciones y Visitas</w:t>
+      </w:r>
+    </w:p>
+    <w:p>
+      <w:pPr>
+        <w:spacing w:before="100" w:beforeAutospacing="1" w:after="100" w:afterAutospacing="1" w:line="240" w:lineRule="auto"/>
+        <w:rPr>
+          <w:rFonts w:ascii="Times New Roman" w:eastAsia="Times New Roman" w:hAnsi="Times New Roman" w:cs="Times New Roman"/>
+          <w:sz w:val="24"/>
+          <w:szCs w:val="24"/>
+          <w:lang w:eastAsia="es-AR"/>
+        </w:rPr>
+      </w:pPr>
+      <w:r>
+        <w:rPr>
+          <w:rFonts w:ascii="Times New Roman" w:eastAsia="Times New Roman" w:hAnsi="Times New Roman" w:cs="Times New Roman"/>
+          <w:b/>
+          <w:bCs/>
+          <w:sz w:val="24"/>
+          <w:szCs w:val="24"/>
+          <w:lang w:eastAsia="es-AR"/>
+        </w:rPr>
+        <w:t>1. Entidades Principales y Secundarias</w:t>
+      </w:r>
+    </w:p>
+    <w:p>
+      <w:pPr>
+        <w:numPr>
+          <w:ilvl w:val="0"/>
+          <w:numId w:val="36"/>
+        </w:numPr>
+        <w:spacing w:before="100" w:beforeAutospacing="1" w:after="100" w:afterAutospacing="1" w:line="240" w:lineRule="auto"/>
+        <w:rPr>
+          <w:rFonts w:ascii="Times New Roman" w:eastAsia="Times New Roman" w:hAnsi="Times New Roman" w:cs="Times New Roman"/>
+          <w:sz w:val="24"/>
+          <w:szCs w:val="24"/>
+          <w:lang w:eastAsia="es-AR"/>
+        </w:rPr>
+      </w:pPr>
+      <w:r>
+        <w:rPr>
+          <w:rFonts w:ascii="Times New Roman" w:eastAsia="Times New Roman" w:hAnsi="Times New Roman" w:cs="Times New Roman"/>
+          <w:b/>
+          <w:bCs/>
+          <w:sz w:val="24"/>
+          <w:szCs w:val="24"/>
+          <w:lang w:eastAsia="es-AR"/>
+        </w:rPr>
+        <w:t>Entidades Principales (Fuertes) Nuevas:</w:t>
+      </w:r>
+      <w:r>
+        <w:rPr>
+          <w:rFonts w:ascii="Times New Roman" w:eastAsia="Times New Roman" w:hAnsi="Times New Roman" w:cs="Times New Roman"/>
+          <w:sz w:val="24"/>
+          <w:szCs w:val="24"/>
+          <w:lang w:eastAsia="es-AR"/>
+        </w:rPr>
+        <w:t xml:space="preserve"> </w:t>
+      </w:r>
+      <w:r>
+        <w:rPr>
+          <w:rFonts w:ascii="Courier New" w:eastAsia="Times New Roman" w:hAnsi="Courier New" w:cs="Courier New"/>
+          <w:sz w:val="20"/>
+          <w:szCs w:val="20"/>
+          <w:lang w:eastAsia="es-AR"/>
+        </w:rPr>
+        <w:t>CLIENTES_INTERESADOS</w:t>
+      </w:r>
+      <w:r>
+        <w:rPr>
+          <w:rFonts w:ascii="Times New Roman" w:eastAsia="Times New Roman" w:hAnsi="Times New Roman" w:cs="Times New Roman"/>
+          <w:sz w:val="24"/>
+          <w:szCs w:val="24"/>
+          <w:lang w:eastAsia="es-AR"/>
+        </w:rPr>
+        <w:t>. Tiene existencia independiente en la base de datos, igual que los Propietarios y los Agentes.</w:t>
+      </w:r>
+    </w:p>
+    <w:p>
+      <w:pPr>
+        <w:numPr>
+          <w:ilvl w:val="0"/>
+          <w:numId w:val="36"/>
+        </w:numPr>
+        <w:spacing w:before="100" w:beforeAutospacing="1" w:after="100" w:afterAutospacing="1" w:line="240" w:lineRule="auto"/>
+        <w:rPr>
+          <w:rFonts w:ascii="Times New Roman" w:eastAsia="Times New Roman" w:hAnsi="Times New Roman" w:cs="Times New Roman"/>
+          <w:sz w:val="24"/>
+          <w:szCs w:val="24"/>
+          <w:lang w:eastAsia="es-AR"/>
+        </w:rPr>
+      </w:pPr>
+      <w:r>
+        <w:rPr>
+          <w:rFonts w:ascii="Times New Roman" w:eastAsia="Times New Roman" w:hAnsi="Times New Roman" w:cs="Times New Roman"/>
+          <w:b/>
+          <w:bCs/>
+          <w:sz w:val="24"/>
+          <w:szCs w:val="24"/>
+          <w:lang w:eastAsia="es-AR"/>
+        </w:rPr>
+        <w:t>Entidades Secundarias / Eventos Nuevos:</w:t>
+      </w:r>
+      <w:r>
+        <w:rPr>
+          <w:rFonts w:ascii="Times New Roman" w:eastAsia="Times New Roman" w:hAnsi="Times New Roman" w:cs="Times New Roman"/>
+          <w:sz w:val="24"/>
+          <w:szCs w:val="24"/>
+          <w:lang w:eastAsia="es-AR"/>
+        </w:rPr>
+        <w:t xml:space="preserve"> </w:t>
+      </w:r>
+      <w:r>
+        <w:rPr>
+          <w:rFonts w:ascii="Courier New" w:eastAsia="Times New Roman" w:hAnsi="Courier New" w:cs="Courier New"/>
+          <w:sz w:val="20"/>
+          <w:szCs w:val="20"/>
+          <w:lang w:eastAsia="es-AR"/>
+        </w:rPr>
+        <w:t>VISITAS</w:t>
+      </w:r>
+      <w:r>
+        <w:rPr>
+          <w:rFonts w:ascii="Times New Roman" w:eastAsia="Times New Roman" w:hAnsi="Times New Roman" w:cs="Times New Roman"/>
+          <w:sz w:val="24"/>
+          <w:szCs w:val="24"/>
+          <w:lang w:eastAsia="es-AR"/>
+        </w:rPr>
+        <w:t xml:space="preserve"> y </w:t>
+      </w:r>
+      <w:r>
+        <w:rPr>
+          <w:rFonts w:ascii="Courier New" w:eastAsia="Times New Roman" w:hAnsi="Courier New" w:cs="Courier New"/>
+          <w:sz w:val="20"/>
+          <w:szCs w:val="20"/>
+          <w:lang w:eastAsia="es-AR"/>
+        </w:rPr>
+        <w:t>OPERACIONES</w:t>
+      </w:r>
+      <w:r>
+        <w:rPr>
+          <w:rFonts w:ascii="Times New Roman" w:eastAsia="Times New Roman" w:hAnsi="Times New Roman" w:cs="Times New Roman"/>
+          <w:sz w:val="24"/>
+          <w:szCs w:val="24"/>
+          <w:lang w:eastAsia="es-AR"/>
+        </w:rPr>
+        <w:t xml:space="preserve">. Aunque conceptualmente representan "acciones", al requerir guardar su propia fecha, hora, montos e involucrar a múltiples actores simultáneamente, la teoría de diseño dicta que se deben modelar como Entidades Débiles (o Fuertes con </w:t>
+      </w:r>
+      <w:proofErr w:type="spellStart"/>
+      <w:r>
+        <w:rPr>
+          <w:rFonts w:ascii="Times New Roman" w:eastAsia="Times New Roman" w:hAnsi="Times New Roman" w:cs="Times New Roman"/>
+          <w:sz w:val="24"/>
+          <w:szCs w:val="24"/>
+          <w:lang w:eastAsia="es-AR"/>
+        </w:rPr>
+        <w:t>IDs</w:t>
+      </w:r>
+      <w:proofErr w:type="spellEnd"/>
+      <w:r>
+        <w:rPr>
+          <w:rFonts w:ascii="Times New Roman" w:eastAsia="Times New Roman" w:hAnsi="Times New Roman" w:cs="Times New Roman"/>
+          <w:sz w:val="24"/>
+          <w:szCs w:val="24"/>
+          <w:lang w:eastAsia="es-AR"/>
+        </w:rPr>
+        <w:t xml:space="preserve"> artificiales) que actúan como registro del evento.</w:t>
+      </w:r>
+    </w:p>
+    <w:p>
+      <w:pPr>
+        <w:spacing w:before="100" w:beforeAutospacing="1" w:after="100" w:afterAutospacing="1" w:line="240" w:lineRule="auto"/>
+        <w:rPr>
+          <w:rFonts w:ascii="Times New Roman" w:eastAsia="Times New Roman" w:hAnsi="Times New Roman" w:cs="Times New Roman"/>
+          <w:sz w:val="24"/>
+          <w:szCs w:val="24"/>
+          <w:lang w:eastAsia="es-AR"/>
+        </w:rPr>
+      </w:pPr>
+      <w:r>
+        <w:rPr>
+          <w:rFonts w:ascii="Times New Roman" w:eastAsia="Times New Roman" w:hAnsi="Times New Roman" w:cs="Times New Roman"/>
+          <w:b/>
+          <w:bCs/>
+          <w:sz w:val="24"/>
+          <w:szCs w:val="24"/>
+          <w:lang w:eastAsia="es-AR"/>
+        </w:rPr>
+        <w:t>2. Atributos de cada Entidad y su Clasificación</w:t>
+      </w:r>
+    </w:p>
+    <w:p>
+      <w:pPr>
+        <w:numPr>
+          <w:ilvl w:val="0"/>
+          <w:numId w:val="37"/>
+        </w:numPr>
+        <w:spacing w:before="100" w:beforeAutospacing="1" w:after="100" w:afterAutospacing="1" w:line="240" w:lineRule="auto"/>
+        <w:rPr>
+          <w:rFonts w:ascii="Times New Roman" w:eastAsia="Times New Roman" w:hAnsi="Times New Roman" w:cs="Times New Roman"/>
+          <w:sz w:val="24"/>
+          <w:szCs w:val="24"/>
+          <w:lang w:eastAsia="es-AR"/>
+        </w:rPr>
+      </w:pPr>
+      <w:r>
+        <w:rPr>
+          <w:rFonts w:ascii="Times New Roman" w:eastAsia="Times New Roman" w:hAnsi="Times New Roman" w:cs="Times New Roman"/>
+          <w:b/>
+          <w:bCs/>
+          <w:sz w:val="24"/>
+          <w:szCs w:val="24"/>
+          <w:lang w:eastAsia="es-AR"/>
+        </w:rPr>
+        <w:t>CLIENTES_INTERESADOS:</w:t>
+      </w:r>
+      <w:r>
+        <w:rPr>
+          <w:rFonts w:ascii="Times New Roman" w:eastAsia="Times New Roman" w:hAnsi="Times New Roman" w:cs="Times New Roman"/>
+          <w:sz w:val="24"/>
+          <w:szCs w:val="24"/>
+          <w:lang w:eastAsia="es-AR"/>
+        </w:rPr>
+        <w:t xml:space="preserve"> DNI (Simple), nombre (Simple), apellido (Simple), teléfono (Multivaluado), </w:t>
+      </w:r>
+      <w:proofErr w:type="spellStart"/>
+      <w:r>
+        <w:rPr>
+          <w:rFonts w:ascii="Times New Roman" w:eastAsia="Times New Roman" w:hAnsi="Times New Roman" w:cs="Times New Roman"/>
+          <w:sz w:val="24"/>
+          <w:szCs w:val="24"/>
+          <w:lang w:eastAsia="es-AR"/>
+        </w:rPr>
+        <w:t>tipo_propiedad_buscada</w:t>
+      </w:r>
+      <w:proofErr w:type="spellEnd"/>
+      <w:r>
+        <w:rPr>
+          <w:rFonts w:ascii="Times New Roman" w:eastAsia="Times New Roman" w:hAnsi="Times New Roman" w:cs="Times New Roman"/>
+          <w:sz w:val="24"/>
+          <w:szCs w:val="24"/>
+          <w:lang w:eastAsia="es-AR"/>
+        </w:rPr>
+        <w:t xml:space="preserve"> (Simple), </w:t>
+      </w:r>
+      <w:proofErr w:type="spellStart"/>
+      <w:r>
+        <w:rPr>
+          <w:rFonts w:ascii="Times New Roman" w:eastAsia="Times New Roman" w:hAnsi="Times New Roman" w:cs="Times New Roman"/>
+          <w:sz w:val="24"/>
+          <w:szCs w:val="24"/>
+          <w:lang w:eastAsia="es-AR"/>
+        </w:rPr>
+        <w:t>zona_buscada</w:t>
+      </w:r>
+      <w:proofErr w:type="spellEnd"/>
+      <w:r>
+        <w:rPr>
+          <w:rFonts w:ascii="Times New Roman" w:eastAsia="Times New Roman" w:hAnsi="Times New Roman" w:cs="Times New Roman"/>
+          <w:sz w:val="24"/>
+          <w:szCs w:val="24"/>
+          <w:lang w:eastAsia="es-AR"/>
+        </w:rPr>
+        <w:t xml:space="preserve"> (Simple), </w:t>
+      </w:r>
+      <w:proofErr w:type="spellStart"/>
+      <w:r>
+        <w:rPr>
+          <w:rFonts w:ascii="Times New Roman" w:eastAsia="Times New Roman" w:hAnsi="Times New Roman" w:cs="Times New Roman"/>
+          <w:sz w:val="24"/>
+          <w:szCs w:val="24"/>
+          <w:lang w:eastAsia="es-AR"/>
+        </w:rPr>
+        <w:t>rango_precios</w:t>
+      </w:r>
+      <w:proofErr w:type="spellEnd"/>
+      <w:r>
+        <w:rPr>
+          <w:rFonts w:ascii="Times New Roman" w:eastAsia="Times New Roman" w:hAnsi="Times New Roman" w:cs="Times New Roman"/>
+          <w:sz w:val="24"/>
+          <w:szCs w:val="24"/>
+          <w:lang w:eastAsia="es-AR"/>
+        </w:rPr>
+        <w:t xml:space="preserve"> (Compuesto por: </w:t>
+      </w:r>
+      <w:proofErr w:type="spellStart"/>
+      <w:r>
+        <w:rPr>
+          <w:rFonts w:ascii="Times New Roman" w:eastAsia="Times New Roman" w:hAnsi="Times New Roman" w:cs="Times New Roman"/>
+          <w:sz w:val="24"/>
+          <w:szCs w:val="24"/>
+          <w:lang w:eastAsia="es-AR"/>
+        </w:rPr>
+        <w:t>precio_minimo</w:t>
+      </w:r>
+      <w:proofErr w:type="spellEnd"/>
+      <w:r>
+        <w:rPr>
+          <w:rFonts w:ascii="Times New Roman" w:eastAsia="Times New Roman" w:hAnsi="Times New Roman" w:cs="Times New Roman"/>
+          <w:sz w:val="24"/>
+          <w:szCs w:val="24"/>
+          <w:lang w:eastAsia="es-AR"/>
+        </w:rPr>
+        <w:t xml:space="preserve"> y </w:t>
+      </w:r>
+      <w:proofErr w:type="spellStart"/>
+      <w:r>
+        <w:rPr>
+          <w:rFonts w:ascii="Times New Roman" w:eastAsia="Times New Roman" w:hAnsi="Times New Roman" w:cs="Times New Roman"/>
+          <w:sz w:val="24"/>
+          <w:szCs w:val="24"/>
+          <w:lang w:eastAsia="es-AR"/>
+        </w:rPr>
+        <w:t>precio_maximo</w:t>
+      </w:r>
+      <w:proofErr w:type="spellEnd"/>
+      <w:r>
+        <w:rPr>
+          <w:rFonts w:ascii="Times New Roman" w:eastAsia="Times New Roman" w:hAnsi="Times New Roman" w:cs="Times New Roman"/>
+          <w:sz w:val="24"/>
+          <w:szCs w:val="24"/>
+          <w:lang w:eastAsia="es-AR"/>
+        </w:rPr>
+        <w:t>).</w:t>
+      </w:r>
+    </w:p>
+    <w:p>
+      <w:pPr>
+        <w:numPr>
+          <w:ilvl w:val="0"/>
+          <w:numId w:val="37"/>
+        </w:numPr>
+        <w:spacing w:before="100" w:beforeAutospacing="1" w:after="100" w:afterAutospacing="1" w:line="240" w:lineRule="auto"/>
+        <w:rPr>
+          <w:rFonts w:ascii="Times New Roman" w:eastAsia="Times New Roman" w:hAnsi="Times New Roman" w:cs="Times New Roman"/>
+          <w:sz w:val="24"/>
+          <w:szCs w:val="24"/>
+          <w:lang w:eastAsia="es-AR"/>
+        </w:rPr>
+      </w:pPr>
+      <w:r>
+        <w:rPr>
+          <w:rFonts w:ascii="Times New Roman" w:eastAsia="Times New Roman" w:hAnsi="Times New Roman" w:cs="Times New Roman"/>
+          <w:b/>
+          <w:bCs/>
+          <w:sz w:val="24"/>
+          <w:szCs w:val="24"/>
+          <w:lang w:eastAsia="es-AR"/>
+        </w:rPr>
+        <w:t>VISITAS:</w:t>
+      </w:r>
+      <w:r>
+        <w:rPr>
+          <w:rFonts w:ascii="Times New Roman" w:eastAsia="Times New Roman" w:hAnsi="Times New Roman" w:cs="Times New Roman"/>
+          <w:sz w:val="24"/>
+          <w:szCs w:val="24"/>
+          <w:lang w:eastAsia="es-AR"/>
+        </w:rPr>
+        <w:t xml:space="preserve"> fecha (Simple), hora (Simple).</w:t>
+      </w:r>
+    </w:p>
+    <w:p>
+      <w:pPr>
+        <w:numPr>
+          <w:ilvl w:val="0"/>
+          <w:numId w:val="37"/>
+        </w:numPr>
+        <w:spacing w:before="100" w:beforeAutospacing="1" w:after="100" w:afterAutospacing="1" w:line="240" w:lineRule="auto"/>
+        <w:rPr>
+          <w:rFonts w:ascii="Times New Roman" w:eastAsia="Times New Roman" w:hAnsi="Times New Roman" w:cs="Times New Roman"/>
+          <w:sz w:val="24"/>
+          <w:szCs w:val="24"/>
+          <w:lang w:eastAsia="es-AR"/>
+        </w:rPr>
+      </w:pPr>
+      <w:r>
+        <w:rPr>
+          <w:rFonts w:ascii="Times New Roman" w:eastAsia="Times New Roman" w:hAnsi="Times New Roman" w:cs="Times New Roman"/>
+          <w:b/>
+          <w:bCs/>
+          <w:sz w:val="24"/>
+          <w:szCs w:val="24"/>
+          <w:lang w:eastAsia="es-AR"/>
+        </w:rPr>
+        <w:t>OPERACIONES:</w:t>
+      </w:r>
+      <w:r>
+        <w:rPr>
+          <w:rFonts w:ascii="Times New Roman" w:eastAsia="Times New Roman" w:hAnsi="Times New Roman" w:cs="Times New Roman"/>
+          <w:sz w:val="24"/>
+          <w:szCs w:val="24"/>
+          <w:lang w:eastAsia="es-AR"/>
+        </w:rPr>
+        <w:t xml:space="preserve"> </w:t>
+      </w:r>
+      <w:proofErr w:type="spellStart"/>
+      <w:r>
+        <w:rPr>
+          <w:rFonts w:ascii="Times New Roman" w:eastAsia="Times New Roman" w:hAnsi="Times New Roman" w:cs="Times New Roman"/>
+          <w:sz w:val="24"/>
+          <w:szCs w:val="24"/>
+          <w:lang w:eastAsia="es-AR"/>
+        </w:rPr>
+        <w:t>tipo_operacion</w:t>
+      </w:r>
+      <w:proofErr w:type="spellEnd"/>
+      <w:r>
+        <w:rPr>
+          <w:rFonts w:ascii="Times New Roman" w:eastAsia="Times New Roman" w:hAnsi="Times New Roman" w:cs="Times New Roman"/>
+          <w:sz w:val="24"/>
+          <w:szCs w:val="24"/>
+          <w:lang w:eastAsia="es-AR"/>
+        </w:rPr>
+        <w:t xml:space="preserve"> (Simple), fecha (Simple), </w:t>
+      </w:r>
+      <w:proofErr w:type="spellStart"/>
+      <w:r>
+        <w:rPr>
+          <w:rFonts w:ascii="Times New Roman" w:eastAsia="Times New Roman" w:hAnsi="Times New Roman" w:cs="Times New Roman"/>
+          <w:sz w:val="24"/>
+          <w:szCs w:val="24"/>
+          <w:lang w:eastAsia="es-AR"/>
+        </w:rPr>
+        <w:t>monto_final</w:t>
+      </w:r>
+      <w:proofErr w:type="spellEnd"/>
+      <w:r>
+        <w:rPr>
+          <w:rFonts w:ascii="Times New Roman" w:eastAsia="Times New Roman" w:hAnsi="Times New Roman" w:cs="Times New Roman"/>
+          <w:sz w:val="24"/>
+          <w:szCs w:val="24"/>
+          <w:lang w:eastAsia="es-AR"/>
+        </w:rPr>
+        <w:t xml:space="preserve"> (Simple).</w:t>
+      </w:r>
+    </w:p>
+    <w:p>
+      <w:pPr>
+        <w:spacing w:before="100" w:beforeAutospacing="1" w:after="100" w:afterAutospacing="1" w:line="240" w:lineRule="auto"/>
+        <w:rPr>
+          <w:rFonts w:ascii="Times New Roman" w:eastAsia="Times New Roman" w:hAnsi="Times New Roman" w:cs="Times New Roman"/>
+          <w:sz w:val="24"/>
+          <w:szCs w:val="24"/>
+          <w:lang w:eastAsia="es-AR"/>
+        </w:rPr>
+      </w:pPr>
+      <w:r>
+        <w:rPr>
+          <w:rFonts w:ascii="Times New Roman" w:eastAsia="Times New Roman" w:hAnsi="Times New Roman" w:cs="Times New Roman"/>
+          <w:b/>
+          <w:bCs/>
+          <w:sz w:val="24"/>
+          <w:szCs w:val="24"/>
+          <w:lang w:eastAsia="es-AR"/>
+        </w:rPr>
+        <w:t>3. Relaciones o vínculos entre entidades</w:t>
+      </w:r>
+      <w:r>
+        <w:rPr>
+          <w:rFonts w:ascii="Times New Roman" w:eastAsia="Times New Roman" w:hAnsi="Times New Roman" w:cs="Times New Roman"/>
+          <w:sz w:val="24"/>
+          <w:szCs w:val="24"/>
+          <w:lang w:eastAsia="es-AR"/>
+        </w:rPr>
+        <w:t xml:space="preserve"> Para cada evento (Visita y Operación) existen tres relaciones binarias que conectan el registro con sus participantes:</w:t>
+      </w:r>
+    </w:p>
+    <w:p>
+      <w:pPr>
+        <w:numPr>
+          <w:ilvl w:val="0"/>
+          <w:numId w:val="38"/>
+        </w:numPr>
+        <w:spacing w:before="100" w:beforeAutospacing="1" w:after="100" w:afterAutospacing="1" w:line="240" w:lineRule="auto"/>
+        <w:rPr>
+          <w:rFonts w:ascii="Times New Roman" w:eastAsia="Times New Roman" w:hAnsi="Times New Roman" w:cs="Times New Roman"/>
+          <w:sz w:val="24"/>
+          <w:szCs w:val="24"/>
+          <w:lang w:eastAsia="es-AR"/>
+        </w:rPr>
+      </w:pPr>
+      <w:r>
+        <w:rPr>
+          <w:rFonts w:ascii="Times New Roman" w:eastAsia="Times New Roman" w:hAnsi="Times New Roman" w:cs="Times New Roman"/>
+          <w:b/>
+          <w:bCs/>
+          <w:sz w:val="24"/>
+          <w:szCs w:val="24"/>
+          <w:lang w:eastAsia="es-AR"/>
+        </w:rPr>
+        <w:t>Para VISITAS:</w:t>
+      </w:r>
+    </w:p>
+    <w:p>
+      <w:pPr>
+        <w:numPr>
+          <w:ilvl w:val="1"/>
+          <w:numId w:val="38"/>
+        </w:numPr>
+        <w:spacing w:before="100" w:beforeAutospacing="1" w:after="100" w:afterAutospacing="1" w:line="240" w:lineRule="auto"/>
+        <w:rPr>
+          <w:rFonts w:ascii="Times New Roman" w:eastAsia="Times New Roman" w:hAnsi="Times New Roman" w:cs="Times New Roman"/>
+          <w:sz w:val="24"/>
+          <w:szCs w:val="24"/>
+          <w:lang w:eastAsia="es-AR"/>
+        </w:rPr>
+      </w:pPr>
+      <w:r>
+        <w:rPr>
+          <w:rFonts w:ascii="Courier New" w:eastAsia="Times New Roman" w:hAnsi="Courier New" w:cs="Courier New"/>
+          <w:sz w:val="20"/>
+          <w:szCs w:val="20"/>
+          <w:lang w:eastAsia="es-AR"/>
+        </w:rPr>
+        <w:t>SOLICITA</w:t>
+      </w:r>
+      <w:r>
+        <w:rPr>
+          <w:rFonts w:ascii="Times New Roman" w:eastAsia="Times New Roman" w:hAnsi="Times New Roman" w:cs="Times New Roman"/>
+          <w:sz w:val="24"/>
+          <w:szCs w:val="24"/>
+          <w:lang w:eastAsia="es-AR"/>
+        </w:rPr>
+        <w:t xml:space="preserve">: Vincula </w:t>
+      </w:r>
+      <w:r>
+        <w:rPr>
+          <w:rFonts w:ascii="Courier New" w:eastAsia="Times New Roman" w:hAnsi="Courier New" w:cs="Courier New"/>
+          <w:sz w:val="20"/>
+          <w:szCs w:val="20"/>
+          <w:lang w:eastAsia="es-AR"/>
+        </w:rPr>
+        <w:t>CLIENTES_INTERESADOS</w:t>
+      </w:r>
+      <w:r>
+        <w:rPr>
+          <w:rFonts w:ascii="Times New Roman" w:eastAsia="Times New Roman" w:hAnsi="Times New Roman" w:cs="Times New Roman"/>
+          <w:sz w:val="24"/>
+          <w:szCs w:val="24"/>
+          <w:lang w:eastAsia="es-AR"/>
+        </w:rPr>
+        <w:t xml:space="preserve"> con </w:t>
+      </w:r>
+      <w:r>
+        <w:rPr>
+          <w:rFonts w:ascii="Courier New" w:eastAsia="Times New Roman" w:hAnsi="Courier New" w:cs="Courier New"/>
+          <w:sz w:val="20"/>
+          <w:szCs w:val="20"/>
+          <w:lang w:eastAsia="es-AR"/>
+        </w:rPr>
+        <w:t>VISITAS</w:t>
+      </w:r>
+      <w:r>
+        <w:rPr>
+          <w:rFonts w:ascii="Times New Roman" w:eastAsia="Times New Roman" w:hAnsi="Times New Roman" w:cs="Times New Roman"/>
+          <w:sz w:val="24"/>
+          <w:szCs w:val="24"/>
+          <w:lang w:eastAsia="es-AR"/>
+        </w:rPr>
+        <w:t>.</w:t>
+      </w:r>
+    </w:p>
+    <w:p>
+      <w:pPr>
+        <w:numPr>
+          <w:ilvl w:val="1"/>
+          <w:numId w:val="38"/>
+        </w:numPr>
+        <w:spacing w:before="100" w:beforeAutospacing="1" w:after="100" w:afterAutospacing="1" w:line="240" w:lineRule="auto"/>
+        <w:rPr>
+          <w:rFonts w:ascii="Times New Roman" w:eastAsia="Times New Roman" w:hAnsi="Times New Roman" w:cs="Times New Roman"/>
+          <w:sz w:val="24"/>
+          <w:szCs w:val="24"/>
+          <w:lang w:eastAsia="es-AR"/>
+        </w:rPr>
+      </w:pPr>
+      <w:r>
+        <w:rPr>
+          <w:rFonts w:ascii="Courier New" w:eastAsia="Times New Roman" w:hAnsi="Courier New" w:cs="Courier New"/>
+          <w:sz w:val="20"/>
+          <w:szCs w:val="20"/>
+          <w:lang w:eastAsia="es-AR"/>
+        </w:rPr>
+        <w:t>ACOMPAÑA</w:t>
+      </w:r>
+      <w:r>
+        <w:rPr>
+          <w:rFonts w:ascii="Times New Roman" w:eastAsia="Times New Roman" w:hAnsi="Times New Roman" w:cs="Times New Roman"/>
+          <w:sz w:val="24"/>
+          <w:szCs w:val="24"/>
+          <w:lang w:eastAsia="es-AR"/>
+        </w:rPr>
+        <w:t xml:space="preserve">: Vincula </w:t>
+      </w:r>
+      <w:r>
+        <w:rPr>
+          <w:rFonts w:ascii="Courier New" w:eastAsia="Times New Roman" w:hAnsi="Courier New" w:cs="Courier New"/>
+          <w:sz w:val="20"/>
+          <w:szCs w:val="20"/>
+          <w:lang w:eastAsia="es-AR"/>
+        </w:rPr>
+        <w:t>AGENTES</w:t>
+      </w:r>
+      <w:r>
+        <w:rPr>
+          <w:rFonts w:ascii="Times New Roman" w:eastAsia="Times New Roman" w:hAnsi="Times New Roman" w:cs="Times New Roman"/>
+          <w:sz w:val="24"/>
+          <w:szCs w:val="24"/>
+          <w:lang w:eastAsia="es-AR"/>
+        </w:rPr>
+        <w:t xml:space="preserve"> con </w:t>
+      </w:r>
+      <w:r>
+        <w:rPr>
+          <w:rFonts w:ascii="Courier New" w:eastAsia="Times New Roman" w:hAnsi="Courier New" w:cs="Courier New"/>
+          <w:sz w:val="20"/>
+          <w:szCs w:val="20"/>
+          <w:lang w:eastAsia="es-AR"/>
+        </w:rPr>
+        <w:t>VISITAS</w:t>
+      </w:r>
+      <w:r>
+        <w:rPr>
+          <w:rFonts w:ascii="Times New Roman" w:eastAsia="Times New Roman" w:hAnsi="Times New Roman" w:cs="Times New Roman"/>
+          <w:sz w:val="24"/>
+          <w:szCs w:val="24"/>
+          <w:lang w:eastAsia="es-AR"/>
+        </w:rPr>
+        <w:t>.</w:t>
+      </w:r>
+    </w:p>
+    <w:p>
+      <w:pPr>
+        <w:numPr>
+          <w:ilvl w:val="1"/>
+          <w:numId w:val="38"/>
+        </w:numPr>
+        <w:spacing w:before="100" w:beforeAutospacing="1" w:after="100" w:afterAutospacing="1" w:line="240" w:lineRule="auto"/>
+        <w:rPr>
+          <w:rFonts w:ascii="Times New Roman" w:eastAsia="Times New Roman" w:hAnsi="Times New Roman" w:cs="Times New Roman"/>
+          <w:sz w:val="24"/>
+          <w:szCs w:val="24"/>
+          <w:lang w:eastAsia="es-AR"/>
+        </w:rPr>
+      </w:pPr>
+      <w:r>
+        <w:rPr>
+          <w:rFonts w:ascii="Courier New" w:eastAsia="Times New Roman" w:hAnsi="Courier New" w:cs="Courier New"/>
+          <w:sz w:val="20"/>
+          <w:szCs w:val="20"/>
+          <w:lang w:eastAsia="es-AR"/>
+        </w:rPr>
+        <w:t>RECIBE</w:t>
+      </w:r>
+      <w:r>
+        <w:rPr>
+          <w:rFonts w:ascii="Times New Roman" w:eastAsia="Times New Roman" w:hAnsi="Times New Roman" w:cs="Times New Roman"/>
+          <w:sz w:val="24"/>
+          <w:szCs w:val="24"/>
+          <w:lang w:eastAsia="es-AR"/>
+        </w:rPr>
+        <w:t xml:space="preserve">: Vincula </w:t>
+      </w:r>
+      <w:r>
+        <w:rPr>
+          <w:rFonts w:ascii="Courier New" w:eastAsia="Times New Roman" w:hAnsi="Courier New" w:cs="Courier New"/>
+          <w:sz w:val="20"/>
+          <w:szCs w:val="20"/>
+          <w:lang w:eastAsia="es-AR"/>
+        </w:rPr>
+        <w:t>PROPIEDADES</w:t>
+      </w:r>
+      <w:r>
+        <w:rPr>
+          <w:rFonts w:ascii="Times New Roman" w:eastAsia="Times New Roman" w:hAnsi="Times New Roman" w:cs="Times New Roman"/>
+          <w:sz w:val="24"/>
+          <w:szCs w:val="24"/>
+          <w:lang w:eastAsia="es-AR"/>
+        </w:rPr>
+        <w:t xml:space="preserve"> con </w:t>
+      </w:r>
+      <w:r>
+        <w:rPr>
+          <w:rFonts w:ascii="Courier New" w:eastAsia="Times New Roman" w:hAnsi="Courier New" w:cs="Courier New"/>
+          <w:sz w:val="20"/>
+          <w:szCs w:val="20"/>
+          <w:lang w:eastAsia="es-AR"/>
+        </w:rPr>
+        <w:t>VISITAS</w:t>
+      </w:r>
+      <w:r>
+        <w:rPr>
+          <w:rFonts w:ascii="Times New Roman" w:eastAsia="Times New Roman" w:hAnsi="Times New Roman" w:cs="Times New Roman"/>
+          <w:sz w:val="24"/>
+          <w:szCs w:val="24"/>
+          <w:lang w:eastAsia="es-AR"/>
+        </w:rPr>
+        <w:t>.</w:t>
+      </w:r>
+    </w:p>
+    <w:p>
+      <w:pPr>
+        <w:numPr>
+          <w:ilvl w:val="0"/>
+          <w:numId w:val="38"/>
+        </w:numPr>
+        <w:spacing w:before="100" w:beforeAutospacing="1" w:after="100" w:afterAutospacing="1" w:line="240" w:lineRule="auto"/>
+        <w:rPr>
+          <w:rFonts w:ascii="Times New Roman" w:eastAsia="Times New Roman" w:hAnsi="Times New Roman" w:cs="Times New Roman"/>
+          <w:sz w:val="24"/>
+          <w:szCs w:val="24"/>
+          <w:lang w:eastAsia="es-AR"/>
+        </w:rPr>
+      </w:pPr>
+      <w:r>
+        <w:rPr>
+          <w:rFonts w:ascii="Times New Roman" w:eastAsia="Times New Roman" w:hAnsi="Times New Roman" w:cs="Times New Roman"/>
+          <w:b/>
+          <w:bCs/>
+          <w:sz w:val="24"/>
+          <w:szCs w:val="24"/>
+          <w:lang w:eastAsia="es-AR"/>
+        </w:rPr>
+        <w:t>Para OPERACIONES:</w:t>
+      </w:r>
+    </w:p>
+    <w:p>
+      <w:pPr>
+        <w:numPr>
+          <w:ilvl w:val="1"/>
+          <w:numId w:val="38"/>
+        </w:numPr>
+        <w:spacing w:before="100" w:beforeAutospacing="1" w:after="100" w:afterAutospacing="1" w:line="240" w:lineRule="auto"/>
+        <w:rPr>
+          <w:rFonts w:ascii="Times New Roman" w:eastAsia="Times New Roman" w:hAnsi="Times New Roman" w:cs="Times New Roman"/>
+          <w:sz w:val="24"/>
+          <w:szCs w:val="24"/>
+          <w:lang w:eastAsia="es-AR"/>
+        </w:rPr>
+      </w:pPr>
+      <w:r>
+        <w:rPr>
+          <w:rFonts w:ascii="Courier New" w:eastAsia="Times New Roman" w:hAnsi="Courier New" w:cs="Courier New"/>
+          <w:sz w:val="20"/>
+          <w:szCs w:val="20"/>
+          <w:lang w:eastAsia="es-AR"/>
+        </w:rPr>
+        <w:t>PARTICIPA</w:t>
+      </w:r>
+      <w:r>
+        <w:rPr>
+          <w:rFonts w:ascii="Times New Roman" w:eastAsia="Times New Roman" w:hAnsi="Times New Roman" w:cs="Times New Roman"/>
+          <w:sz w:val="24"/>
+          <w:szCs w:val="24"/>
+          <w:lang w:eastAsia="es-AR"/>
+        </w:rPr>
+        <w:t xml:space="preserve">: Vincula </w:t>
+      </w:r>
+      <w:r>
+        <w:rPr>
+          <w:rFonts w:ascii="Courier New" w:eastAsia="Times New Roman" w:hAnsi="Courier New" w:cs="Courier New"/>
+          <w:sz w:val="20"/>
+          <w:szCs w:val="20"/>
+          <w:lang w:eastAsia="es-AR"/>
+        </w:rPr>
+        <w:t>CLIENTES_INTERESADOS</w:t>
+      </w:r>
+      <w:r>
+        <w:rPr>
+          <w:rFonts w:ascii="Times New Roman" w:eastAsia="Times New Roman" w:hAnsi="Times New Roman" w:cs="Times New Roman"/>
+          <w:sz w:val="24"/>
+          <w:szCs w:val="24"/>
+          <w:lang w:eastAsia="es-AR"/>
+        </w:rPr>
+        <w:t xml:space="preserve"> con </w:t>
+      </w:r>
+      <w:r>
+        <w:rPr>
+          <w:rFonts w:ascii="Courier New" w:eastAsia="Times New Roman" w:hAnsi="Courier New" w:cs="Courier New"/>
+          <w:sz w:val="20"/>
+          <w:szCs w:val="20"/>
+          <w:lang w:eastAsia="es-AR"/>
+        </w:rPr>
+        <w:t>OPERACIONES</w:t>
+      </w:r>
+      <w:r>
+        <w:rPr>
+          <w:rFonts w:ascii="Times New Roman" w:eastAsia="Times New Roman" w:hAnsi="Times New Roman" w:cs="Times New Roman"/>
+          <w:sz w:val="24"/>
+          <w:szCs w:val="24"/>
+          <w:lang w:eastAsia="es-AR"/>
+        </w:rPr>
+        <w:t>.</w:t>
+      </w:r>
+    </w:p>
+    <w:p>
+      <w:pPr>
+        <w:numPr>
+          <w:ilvl w:val="1"/>
+          <w:numId w:val="38"/>
+        </w:numPr>
+        <w:spacing w:before="100" w:beforeAutospacing="1" w:after="100" w:afterAutospacing="1" w:line="240" w:lineRule="auto"/>
+        <w:rPr>
+          <w:rFonts w:ascii="Times New Roman" w:eastAsia="Times New Roman" w:hAnsi="Times New Roman" w:cs="Times New Roman"/>
+          <w:sz w:val="24"/>
+          <w:szCs w:val="24"/>
+          <w:lang w:eastAsia="es-AR"/>
+        </w:rPr>
+      </w:pPr>
+      <w:r>
+        <w:rPr>
+          <w:rFonts w:ascii="Courier New" w:eastAsia="Times New Roman" w:hAnsi="Courier New" w:cs="Courier New"/>
+          <w:sz w:val="20"/>
+          <w:szCs w:val="20"/>
+          <w:lang w:eastAsia="es-AR"/>
+        </w:rPr>
+        <w:t>CIERRA</w:t>
+      </w:r>
+      <w:r>
+        <w:rPr>
+          <w:rFonts w:ascii="Times New Roman" w:eastAsia="Times New Roman" w:hAnsi="Times New Roman" w:cs="Times New Roman"/>
+          <w:sz w:val="24"/>
+          <w:szCs w:val="24"/>
+          <w:lang w:eastAsia="es-AR"/>
+        </w:rPr>
+        <w:t xml:space="preserve">: Vincula </w:t>
+      </w:r>
+      <w:r>
+        <w:rPr>
+          <w:rFonts w:ascii="Courier New" w:eastAsia="Times New Roman" w:hAnsi="Courier New" w:cs="Courier New"/>
+          <w:sz w:val="20"/>
+          <w:szCs w:val="20"/>
+          <w:lang w:eastAsia="es-AR"/>
+        </w:rPr>
+        <w:t>AGENTES</w:t>
+      </w:r>
+      <w:r>
+        <w:rPr>
+          <w:rFonts w:ascii="Times New Roman" w:eastAsia="Times New Roman" w:hAnsi="Times New Roman" w:cs="Times New Roman"/>
+          <w:sz w:val="24"/>
+          <w:szCs w:val="24"/>
+          <w:lang w:eastAsia="es-AR"/>
+        </w:rPr>
+        <w:t xml:space="preserve"> con </w:t>
+      </w:r>
+      <w:r>
+        <w:rPr>
+          <w:rFonts w:ascii="Courier New" w:eastAsia="Times New Roman" w:hAnsi="Courier New" w:cs="Courier New"/>
+          <w:sz w:val="20"/>
+          <w:szCs w:val="20"/>
+          <w:lang w:eastAsia="es-AR"/>
+        </w:rPr>
+        <w:t>OPERACIONES</w:t>
+      </w:r>
+      <w:r>
+        <w:rPr>
+          <w:rFonts w:ascii="Times New Roman" w:eastAsia="Times New Roman" w:hAnsi="Times New Roman" w:cs="Times New Roman"/>
+          <w:sz w:val="24"/>
+          <w:szCs w:val="24"/>
+          <w:lang w:eastAsia="es-AR"/>
+        </w:rPr>
+        <w:t>.</w:t>
+      </w:r>
+    </w:p>
+    <w:p>
+      <w:pPr>
+        <w:numPr>
+          <w:ilvl w:val="1"/>
+          <w:numId w:val="38"/>
+        </w:numPr>
+        <w:spacing w:before="100" w:beforeAutospacing="1" w:after="100" w:afterAutospacing="1" w:line="240" w:lineRule="auto"/>
+        <w:rPr>
+          <w:rFonts w:ascii="Times New Roman" w:eastAsia="Times New Roman" w:hAnsi="Times New Roman" w:cs="Times New Roman"/>
+          <w:sz w:val="24"/>
+          <w:szCs w:val="24"/>
+          <w:lang w:eastAsia="es-AR"/>
+        </w:rPr>
+      </w:pPr>
+      <w:r>
+        <w:rPr>
+          <w:rFonts w:ascii="Courier New" w:eastAsia="Times New Roman" w:hAnsi="Courier New" w:cs="Courier New"/>
+          <w:sz w:val="20"/>
+          <w:szCs w:val="20"/>
+          <w:lang w:eastAsia="es-AR"/>
+        </w:rPr>
+        <w:t>INVOLUCRA</w:t>
+      </w:r>
+      <w:r>
+        <w:rPr>
+          <w:rFonts w:ascii="Times New Roman" w:eastAsia="Times New Roman" w:hAnsi="Times New Roman" w:cs="Times New Roman"/>
+          <w:sz w:val="24"/>
+          <w:szCs w:val="24"/>
+          <w:lang w:eastAsia="es-AR"/>
+        </w:rPr>
+        <w:t xml:space="preserve">: Vincula </w:t>
+      </w:r>
+      <w:r>
+        <w:rPr>
+          <w:rFonts w:ascii="Courier New" w:eastAsia="Times New Roman" w:hAnsi="Courier New" w:cs="Courier New"/>
+          <w:sz w:val="20"/>
+          <w:szCs w:val="20"/>
+          <w:lang w:eastAsia="es-AR"/>
+        </w:rPr>
+        <w:t>PROPIEDADES</w:t>
+      </w:r>
+      <w:r>
+        <w:rPr>
+          <w:rFonts w:ascii="Times New Roman" w:eastAsia="Times New Roman" w:hAnsi="Times New Roman" w:cs="Times New Roman"/>
+          <w:sz w:val="24"/>
+          <w:szCs w:val="24"/>
+          <w:lang w:eastAsia="es-AR"/>
+        </w:rPr>
+        <w:t xml:space="preserve"> con </w:t>
+      </w:r>
+      <w:r>
+        <w:rPr>
+          <w:rFonts w:ascii="Courier New" w:eastAsia="Times New Roman" w:hAnsi="Courier New" w:cs="Courier New"/>
+          <w:sz w:val="20"/>
+          <w:szCs w:val="20"/>
+          <w:lang w:eastAsia="es-AR"/>
+        </w:rPr>
+        <w:t>OPERACIONES</w:t>
+      </w:r>
+      <w:r>
+        <w:rPr>
+          <w:rFonts w:ascii="Times New Roman" w:eastAsia="Times New Roman" w:hAnsi="Times New Roman" w:cs="Times New Roman"/>
+          <w:sz w:val="24"/>
+          <w:szCs w:val="24"/>
+          <w:lang w:eastAsia="es-AR"/>
+        </w:rPr>
+        <w:t>.</w:t>
+      </w:r>
+    </w:p>
+    <w:p>
+      <w:pPr>
+        <w:spacing w:before="100" w:beforeAutospacing="1" w:after="100" w:afterAutospacing="1" w:line="240" w:lineRule="auto"/>
+        <w:rPr>
+          <w:rFonts w:ascii="Times New Roman" w:eastAsia="Times New Roman" w:hAnsi="Times New Roman" w:cs="Times New Roman"/>
+          <w:sz w:val="24"/>
+          <w:szCs w:val="24"/>
+          <w:lang w:eastAsia="es-AR"/>
+        </w:rPr>
+      </w:pPr>
+      <w:r>
+        <w:rPr>
+          <w:rFonts w:ascii="Times New Roman" w:eastAsia="Times New Roman" w:hAnsi="Times New Roman" w:cs="Times New Roman"/>
+          <w:b/>
+          <w:bCs/>
+          <w:sz w:val="24"/>
+          <w:szCs w:val="24"/>
+          <w:lang w:eastAsia="es-AR"/>
+        </w:rPr>
+        <w:t>4. Dominio, Grado y Cardinalidad</w:t>
+      </w:r>
+    </w:p>
+    <w:p>
+      <w:pPr>
+        <w:numPr>
+          <w:ilvl w:val="0"/>
+          <w:numId w:val="39"/>
+        </w:numPr>
+        <w:spacing w:before="100" w:beforeAutospacing="1" w:after="100" w:afterAutospacing="1" w:line="240" w:lineRule="auto"/>
+        <w:rPr>
+          <w:rFonts w:ascii="Times New Roman" w:eastAsia="Times New Roman" w:hAnsi="Times New Roman" w:cs="Times New Roman"/>
+          <w:sz w:val="24"/>
+          <w:szCs w:val="24"/>
+          <w:lang w:eastAsia="es-AR"/>
+        </w:rPr>
+      </w:pPr>
+      <w:r>
+        <w:rPr>
+          <w:rFonts w:ascii="Times New Roman" w:eastAsia="Times New Roman" w:hAnsi="Times New Roman" w:cs="Times New Roman"/>
+          <w:b/>
+          <w:bCs/>
+          <w:sz w:val="24"/>
+          <w:szCs w:val="24"/>
+          <w:lang w:eastAsia="es-AR"/>
+        </w:rPr>
+        <w:t>Dominios:</w:t>
+      </w:r>
+      <w:r>
+        <w:rPr>
+          <w:rFonts w:ascii="Times New Roman" w:eastAsia="Times New Roman" w:hAnsi="Times New Roman" w:cs="Times New Roman"/>
+          <w:sz w:val="24"/>
+          <w:szCs w:val="24"/>
+          <w:lang w:eastAsia="es-AR"/>
+        </w:rPr>
+        <w:t xml:space="preserve"> </w:t>
+      </w:r>
+      <w:r>
+        <w:rPr>
+          <w:rFonts w:ascii="Courier New" w:eastAsia="Times New Roman" w:hAnsi="Courier New" w:cs="Courier New"/>
+          <w:sz w:val="20"/>
+          <w:szCs w:val="20"/>
+          <w:lang w:eastAsia="es-AR"/>
+        </w:rPr>
+        <w:t>fecha</w:t>
+      </w:r>
+      <w:r>
+        <w:rPr>
+          <w:rFonts w:ascii="Times New Roman" w:eastAsia="Times New Roman" w:hAnsi="Times New Roman" w:cs="Times New Roman"/>
+          <w:sz w:val="24"/>
+          <w:szCs w:val="24"/>
+          <w:lang w:eastAsia="es-AR"/>
+        </w:rPr>
+        <w:t xml:space="preserve"> (Date), </w:t>
+      </w:r>
+      <w:r>
+        <w:rPr>
+          <w:rFonts w:ascii="Courier New" w:eastAsia="Times New Roman" w:hAnsi="Courier New" w:cs="Courier New"/>
+          <w:sz w:val="20"/>
+          <w:szCs w:val="20"/>
+          <w:lang w:eastAsia="es-AR"/>
+        </w:rPr>
+        <w:t>hora</w:t>
+      </w:r>
+      <w:r>
+        <w:rPr>
+          <w:rFonts w:ascii="Times New Roman" w:eastAsia="Times New Roman" w:hAnsi="Times New Roman" w:cs="Times New Roman"/>
+          <w:sz w:val="24"/>
+          <w:szCs w:val="24"/>
+          <w:lang w:eastAsia="es-AR"/>
+        </w:rPr>
+        <w:t xml:space="preserve"> (Time), </w:t>
+      </w:r>
+      <w:proofErr w:type="spellStart"/>
+      <w:r>
+        <w:rPr>
+          <w:rFonts w:ascii="Courier New" w:eastAsia="Times New Roman" w:hAnsi="Courier New" w:cs="Courier New"/>
+          <w:sz w:val="20"/>
+          <w:szCs w:val="20"/>
+          <w:lang w:eastAsia="es-AR"/>
+        </w:rPr>
+        <w:t>monto_final</w:t>
+      </w:r>
+      <w:proofErr w:type="spellEnd"/>
+      <w:r>
+        <w:rPr>
+          <w:rFonts w:ascii="Times New Roman" w:eastAsia="Times New Roman" w:hAnsi="Times New Roman" w:cs="Times New Roman"/>
+          <w:sz w:val="24"/>
+          <w:szCs w:val="24"/>
+          <w:lang w:eastAsia="es-AR"/>
+        </w:rPr>
+        <w:t xml:space="preserve"> (Decimal/</w:t>
+      </w:r>
+      <w:proofErr w:type="spellStart"/>
+      <w:r>
+        <w:rPr>
+          <w:rFonts w:ascii="Times New Roman" w:eastAsia="Times New Roman" w:hAnsi="Times New Roman" w:cs="Times New Roman"/>
+          <w:sz w:val="24"/>
+          <w:szCs w:val="24"/>
+          <w:lang w:eastAsia="es-AR"/>
+        </w:rPr>
+        <w:t>Double</w:t>
+      </w:r>
+      <w:proofErr w:type="spellEnd"/>
+      <w:r>
+        <w:rPr>
+          <w:rFonts w:ascii="Times New Roman" w:eastAsia="Times New Roman" w:hAnsi="Times New Roman" w:cs="Times New Roman"/>
+          <w:sz w:val="24"/>
+          <w:szCs w:val="24"/>
+          <w:lang w:eastAsia="es-AR"/>
+        </w:rPr>
+        <w:t xml:space="preserve">), </w:t>
+      </w:r>
+      <w:proofErr w:type="spellStart"/>
+      <w:r>
+        <w:rPr>
+          <w:rFonts w:ascii="Courier New" w:eastAsia="Times New Roman" w:hAnsi="Courier New" w:cs="Courier New"/>
+          <w:sz w:val="20"/>
+          <w:szCs w:val="20"/>
+          <w:lang w:eastAsia="es-AR"/>
+        </w:rPr>
+        <w:t>tipo_operacion</w:t>
+      </w:r>
+      <w:proofErr w:type="spellEnd"/>
+      <w:r>
+        <w:rPr>
+          <w:rFonts w:ascii="Times New Roman" w:eastAsia="Times New Roman" w:hAnsi="Times New Roman" w:cs="Times New Roman"/>
+          <w:sz w:val="24"/>
+          <w:szCs w:val="24"/>
+          <w:lang w:eastAsia="es-AR"/>
+        </w:rPr>
+        <w:t xml:space="preserve"> (</w:t>
+      </w:r>
+      <w:proofErr w:type="spellStart"/>
+      <w:r>
+        <w:rPr>
+          <w:rFonts w:ascii="Times New Roman" w:eastAsia="Times New Roman" w:hAnsi="Times New Roman" w:cs="Times New Roman"/>
+          <w:sz w:val="24"/>
+          <w:szCs w:val="24"/>
+          <w:lang w:eastAsia="es-AR"/>
+        </w:rPr>
+        <w:t>Varchar</w:t>
+      </w:r>
+      <w:proofErr w:type="spellEnd"/>
+      <w:r>
+        <w:rPr>
+          <w:rFonts w:ascii="Times New Roman" w:eastAsia="Times New Roman" w:hAnsi="Times New Roman" w:cs="Times New Roman"/>
+          <w:sz w:val="24"/>
+          <w:szCs w:val="24"/>
+          <w:lang w:eastAsia="es-AR"/>
+        </w:rPr>
+        <w:t>).</w:t>
+      </w:r>
+    </w:p>
+    <w:p>
+      <w:pPr>
+        <w:numPr>
+          <w:ilvl w:val="0"/>
+          <w:numId w:val="39"/>
+        </w:numPr>
+        <w:spacing w:before="100" w:beforeAutospacing="1" w:after="100" w:afterAutospacing="1" w:line="240" w:lineRule="auto"/>
+        <w:rPr>
+          <w:rFonts w:ascii="Times New Roman" w:eastAsia="Times New Roman" w:hAnsi="Times New Roman" w:cs="Times New Roman"/>
+          <w:sz w:val="24"/>
+          <w:szCs w:val="24"/>
+          <w:lang w:eastAsia="es-AR"/>
+        </w:rPr>
+      </w:pPr>
+      <w:r>
+        <w:rPr>
+          <w:rFonts w:ascii="Times New Roman" w:eastAsia="Times New Roman" w:hAnsi="Times New Roman" w:cs="Times New Roman"/>
+          <w:b/>
+          <w:bCs/>
+          <w:sz w:val="24"/>
+          <w:szCs w:val="24"/>
+          <w:lang w:eastAsia="es-AR"/>
+        </w:rPr>
+        <w:t>Grado:</w:t>
+      </w:r>
+      <w:r>
+        <w:rPr>
+          <w:rFonts w:ascii="Times New Roman" w:eastAsia="Times New Roman" w:hAnsi="Times New Roman" w:cs="Times New Roman"/>
+          <w:sz w:val="24"/>
+          <w:szCs w:val="24"/>
+          <w:lang w:eastAsia="es-AR"/>
+        </w:rPr>
+        <w:t xml:space="preserve"> Todas las relaciones planteadas son Binarias (Grado 2). </w:t>
+      </w:r>
+      <w:r>
+        <w:rPr>
+          <w:rFonts w:ascii="Times New Roman" w:eastAsia="Times New Roman" w:hAnsi="Times New Roman" w:cs="Times New Roman"/>
+          <w:i/>
+          <w:iCs/>
+          <w:sz w:val="24"/>
+          <w:szCs w:val="24"/>
+          <w:lang w:eastAsia="es-AR"/>
+        </w:rPr>
+        <w:t>(Nota: Se descarta la relación ternaria para simplificar la lectura cruzada de cardinalidades y facilitar la futura transición al modelo lógico).</w:t>
+      </w:r>
+    </w:p>
+    <w:p>
+      <w:pPr>
+        <w:numPr>
+          <w:ilvl w:val="0"/>
+          <w:numId w:val="39"/>
+        </w:numPr>
+        <w:spacing w:before="100" w:beforeAutospacing="1" w:after="100" w:afterAutospacing="1" w:line="240" w:lineRule="auto"/>
+        <w:rPr>
+          <w:rFonts w:ascii="Times New Roman" w:eastAsia="Times New Roman" w:hAnsi="Times New Roman" w:cs="Times New Roman"/>
+          <w:sz w:val="24"/>
+          <w:szCs w:val="24"/>
+          <w:lang w:eastAsia="es-AR"/>
+        </w:rPr>
+      </w:pPr>
+      <w:r>
+        <w:rPr>
+          <w:rFonts w:ascii="Times New Roman" w:eastAsia="Times New Roman" w:hAnsi="Times New Roman" w:cs="Times New Roman"/>
+          <w:b/>
+          <w:bCs/>
+          <w:sz w:val="24"/>
+          <w:szCs w:val="24"/>
+          <w:lang w:eastAsia="es-AR"/>
+        </w:rPr>
+        <w:t>Cardinalidades (Regla de Máximos Cruzados):</w:t>
+      </w:r>
+    </w:p>
+    <w:p>
+      <w:pPr>
+        <w:numPr>
+          <w:ilvl w:val="1"/>
+          <w:numId w:val="39"/>
+        </w:numPr>
+        <w:spacing w:before="100" w:beforeAutospacing="1" w:after="100" w:afterAutospacing="1" w:line="240" w:lineRule="auto"/>
+        <w:rPr>
+          <w:rFonts w:ascii="Times New Roman" w:eastAsia="Times New Roman" w:hAnsi="Times New Roman" w:cs="Times New Roman"/>
+          <w:sz w:val="24"/>
+          <w:szCs w:val="24"/>
+          <w:lang w:eastAsia="es-AR"/>
+        </w:rPr>
+      </w:pPr>
+      <w:r>
+        <w:rPr>
+          <w:rFonts w:ascii="Times New Roman" w:eastAsia="Times New Roman" w:hAnsi="Times New Roman" w:cs="Times New Roman"/>
+          <w:sz w:val="24"/>
+          <w:szCs w:val="24"/>
+          <w:lang w:eastAsia="es-AR"/>
+        </w:rPr>
+        <w:t xml:space="preserve">Todas las relaciones siguen el mismo patrón estructural </w:t>
+      </w:r>
+      <w:proofErr w:type="gramStart"/>
+      <w:r>
+        <w:rPr>
+          <w:rFonts w:ascii="Times New Roman" w:eastAsia="Times New Roman" w:hAnsi="Times New Roman" w:cs="Times New Roman"/>
+          <w:b/>
+          <w:bCs/>
+          <w:sz w:val="24"/>
+          <w:szCs w:val="24"/>
+          <w:lang w:eastAsia="es-AR"/>
+        </w:rPr>
+        <w:t>1:N</w:t>
+      </w:r>
+      <w:r>
+        <w:rPr>
+          <w:rFonts w:ascii="Times New Roman" w:eastAsia="Times New Roman" w:hAnsi="Times New Roman" w:cs="Times New Roman"/>
+          <w:sz w:val="24"/>
+          <w:szCs w:val="24"/>
+          <w:lang w:eastAsia="es-AR"/>
+        </w:rPr>
+        <w:t>.</w:t>
+      </w:r>
+      <w:proofErr w:type="gramEnd"/>
+    </w:p>
+    <w:p>
+      <w:pPr>
+        <w:numPr>
+          <w:ilvl w:val="1"/>
+          <w:numId w:val="39"/>
+        </w:numPr>
+        <w:spacing w:before="100" w:beforeAutospacing="1" w:after="100" w:afterAutospacing="1" w:line="240" w:lineRule="auto"/>
+        <w:rPr>
+          <w:rFonts w:ascii="Times New Roman" w:eastAsia="Times New Roman" w:hAnsi="Times New Roman" w:cs="Times New Roman"/>
+          <w:sz w:val="24"/>
+          <w:szCs w:val="24"/>
+          <w:lang w:eastAsia="es-AR"/>
+        </w:rPr>
+      </w:pPr>
+      <w:r>
+        <w:rPr>
+          <w:rFonts w:ascii="Times New Roman" w:eastAsia="Times New Roman" w:hAnsi="Times New Roman" w:cs="Times New Roman"/>
+          <w:sz w:val="24"/>
+          <w:szCs w:val="24"/>
+          <w:lang w:eastAsia="es-AR"/>
+        </w:rPr>
+        <w:t xml:space="preserve">Ejemplo Visita: Un Cliente solicita </w:t>
+      </w:r>
+      <w:r>
+        <w:rPr>
+          <w:rFonts w:ascii="Times New Roman" w:eastAsia="Times New Roman" w:hAnsi="Times New Roman" w:cs="Times New Roman"/>
+          <w:b/>
+          <w:bCs/>
+          <w:sz w:val="24"/>
+          <w:szCs w:val="24"/>
+          <w:lang w:eastAsia="es-AR"/>
+        </w:rPr>
+        <w:t>N</w:t>
+      </w:r>
+      <w:r>
+        <w:rPr>
+          <w:rFonts w:ascii="Times New Roman" w:eastAsia="Times New Roman" w:hAnsi="Times New Roman" w:cs="Times New Roman"/>
+          <w:sz w:val="24"/>
+          <w:szCs w:val="24"/>
+          <w:lang w:eastAsia="es-AR"/>
+        </w:rPr>
+        <w:t xml:space="preserve"> Visitas. Una Visita es solicitada por </w:t>
+      </w:r>
+      <w:r>
+        <w:rPr>
+          <w:rFonts w:ascii="Times New Roman" w:eastAsia="Times New Roman" w:hAnsi="Times New Roman" w:cs="Times New Roman"/>
+          <w:b/>
+          <w:bCs/>
+          <w:sz w:val="24"/>
+          <w:szCs w:val="24"/>
+          <w:lang w:eastAsia="es-AR"/>
+        </w:rPr>
+        <w:t>1</w:t>
+      </w:r>
+      <w:r>
+        <w:rPr>
+          <w:rFonts w:ascii="Times New Roman" w:eastAsia="Times New Roman" w:hAnsi="Times New Roman" w:cs="Times New Roman"/>
+          <w:sz w:val="24"/>
+          <w:szCs w:val="24"/>
+          <w:lang w:eastAsia="es-AR"/>
+        </w:rPr>
+        <w:t xml:space="preserve"> Cliente. (La N va en Visitas, el 1 en Clientes).</w:t>
+      </w:r>
+    </w:p>
+    <w:p>
+      <w:pPr>
+        <w:numPr>
+          <w:ilvl w:val="1"/>
+          <w:numId w:val="39"/>
+        </w:numPr>
+        <w:spacing w:before="100" w:beforeAutospacing="1" w:after="100" w:afterAutospacing="1" w:line="240" w:lineRule="auto"/>
+        <w:rPr>
+          <w:rFonts w:ascii="Times New Roman" w:eastAsia="Times New Roman" w:hAnsi="Times New Roman" w:cs="Times New Roman"/>
+          <w:sz w:val="24"/>
+          <w:szCs w:val="24"/>
+          <w:lang w:eastAsia="es-AR"/>
+        </w:rPr>
+      </w:pPr>
+      <w:r>
+        <w:rPr>
+          <w:rFonts w:ascii="Times New Roman" w:eastAsia="Times New Roman" w:hAnsi="Times New Roman" w:cs="Times New Roman"/>
+          <w:sz w:val="24"/>
+          <w:szCs w:val="24"/>
+          <w:lang w:eastAsia="es-AR"/>
+        </w:rPr>
+        <w:lastRenderedPageBreak/>
+        <w:t xml:space="preserve">Ejemplo Operación: Un Agente cierra </w:t>
+      </w:r>
+      <w:r>
+        <w:rPr>
+          <w:rFonts w:ascii="Times New Roman" w:eastAsia="Times New Roman" w:hAnsi="Times New Roman" w:cs="Times New Roman"/>
+          <w:b/>
+          <w:bCs/>
+          <w:sz w:val="24"/>
+          <w:szCs w:val="24"/>
+          <w:lang w:eastAsia="es-AR"/>
+        </w:rPr>
+        <w:t>N</w:t>
+      </w:r>
+      <w:r>
+        <w:rPr>
+          <w:rFonts w:ascii="Times New Roman" w:eastAsia="Times New Roman" w:hAnsi="Times New Roman" w:cs="Times New Roman"/>
+          <w:sz w:val="24"/>
+          <w:szCs w:val="24"/>
+          <w:lang w:eastAsia="es-AR"/>
+        </w:rPr>
+        <w:t xml:space="preserve"> Operaciones. Una Operación es cerrada por </w:t>
+      </w:r>
+      <w:r>
+        <w:rPr>
+          <w:rFonts w:ascii="Times New Roman" w:eastAsia="Times New Roman" w:hAnsi="Times New Roman" w:cs="Times New Roman"/>
+          <w:b/>
+          <w:bCs/>
+          <w:sz w:val="24"/>
+          <w:szCs w:val="24"/>
+          <w:lang w:eastAsia="es-AR"/>
+        </w:rPr>
+        <w:t>1</w:t>
+      </w:r>
+      <w:r>
+        <w:rPr>
+          <w:rFonts w:ascii="Times New Roman" w:eastAsia="Times New Roman" w:hAnsi="Times New Roman" w:cs="Times New Roman"/>
+          <w:sz w:val="24"/>
+          <w:szCs w:val="24"/>
+          <w:lang w:eastAsia="es-AR"/>
+        </w:rPr>
+        <w:t xml:space="preserve"> Agente. (La N va en Operaciones, el 1 en Agentes).</w:t>
+      </w:r>
+    </w:p>
+    <w:p>
+      <w:pPr>
+        <w:spacing w:before="100" w:beforeAutospacing="1" w:after="100" w:afterAutospacing="1" w:line="240" w:lineRule="auto"/>
+        <w:rPr>
+          <w:rFonts w:ascii="Times New Roman" w:eastAsia="Times New Roman" w:hAnsi="Times New Roman" w:cs="Times New Roman"/>
+          <w:sz w:val="24"/>
+          <w:szCs w:val="24"/>
+          <w:lang w:eastAsia="es-AR"/>
+        </w:rPr>
+      </w:pPr>
+      <w:r>
+        <w:rPr>
+          <w:rFonts w:ascii="Times New Roman" w:eastAsia="Times New Roman" w:hAnsi="Times New Roman" w:cs="Times New Roman"/>
+          <w:b/>
+          <w:bCs/>
+          <w:sz w:val="24"/>
+          <w:szCs w:val="24"/>
+          <w:lang w:eastAsia="es-AR"/>
+        </w:rPr>
+        <w:t>5. Atributos principales o candidatos a claves primarias</w:t>
+      </w:r>
+    </w:p>
+    <w:p>
+      <w:pPr>
+        <w:numPr>
+          <w:ilvl w:val="0"/>
+          <w:numId w:val="40"/>
+        </w:numPr>
+        <w:spacing w:before="100" w:beforeAutospacing="1" w:after="100" w:afterAutospacing="1" w:line="240" w:lineRule="auto"/>
+        <w:rPr>
+          <w:rFonts w:ascii="Times New Roman" w:eastAsia="Times New Roman" w:hAnsi="Times New Roman" w:cs="Times New Roman"/>
+          <w:sz w:val="24"/>
+          <w:szCs w:val="24"/>
+          <w:lang w:eastAsia="es-AR"/>
+        </w:rPr>
+      </w:pPr>
+      <w:r>
+        <w:rPr>
+          <w:rFonts w:ascii="Times New Roman" w:eastAsia="Times New Roman" w:hAnsi="Times New Roman" w:cs="Times New Roman"/>
+          <w:b/>
+          <w:bCs/>
+          <w:sz w:val="24"/>
+          <w:szCs w:val="24"/>
+          <w:lang w:eastAsia="es-AR"/>
+        </w:rPr>
+        <w:t>CLIENTES_INTERESADOS:</w:t>
+      </w:r>
+      <w:r>
+        <w:rPr>
+          <w:rFonts w:ascii="Times New Roman" w:eastAsia="Times New Roman" w:hAnsi="Times New Roman" w:cs="Times New Roman"/>
+          <w:sz w:val="24"/>
+          <w:szCs w:val="24"/>
+          <w:lang w:eastAsia="es-AR"/>
+        </w:rPr>
+        <w:t xml:space="preserve"> DNI.</w:t>
+      </w:r>
+    </w:p>
+    <w:p>
+      <w:pPr>
+        <w:numPr>
+          <w:ilvl w:val="0"/>
+          <w:numId w:val="40"/>
+        </w:numPr>
+        <w:spacing w:before="100" w:beforeAutospacing="1" w:after="100" w:afterAutospacing="1" w:line="240" w:lineRule="auto"/>
+        <w:rPr>
+          <w:rFonts w:ascii="Times New Roman" w:eastAsia="Times New Roman" w:hAnsi="Times New Roman" w:cs="Times New Roman"/>
+          <w:sz w:val="24"/>
+          <w:szCs w:val="24"/>
+          <w:lang w:eastAsia="es-AR"/>
+        </w:rPr>
+      </w:pPr>
+      <w:r>
+        <w:rPr>
+          <w:rFonts w:ascii="Times New Roman" w:eastAsia="Times New Roman" w:hAnsi="Times New Roman" w:cs="Times New Roman"/>
+          <w:b/>
+          <w:bCs/>
+          <w:sz w:val="24"/>
+          <w:szCs w:val="24"/>
+          <w:lang w:eastAsia="es-AR"/>
+        </w:rPr>
+        <w:t>VISITAS:</w:t>
+      </w:r>
+      <w:r>
+        <w:rPr>
+          <w:rFonts w:ascii="Times New Roman" w:eastAsia="Times New Roman" w:hAnsi="Times New Roman" w:cs="Times New Roman"/>
+          <w:sz w:val="24"/>
+          <w:szCs w:val="24"/>
+          <w:lang w:eastAsia="es-AR"/>
+        </w:rPr>
+        <w:t xml:space="preserve"> Se debe proponer un </w:t>
+      </w:r>
+      <w:proofErr w:type="spellStart"/>
+      <w:r>
+        <w:rPr>
+          <w:rFonts w:ascii="Courier New" w:eastAsia="Times New Roman" w:hAnsi="Courier New" w:cs="Courier New"/>
+          <w:sz w:val="20"/>
+          <w:szCs w:val="20"/>
+          <w:lang w:eastAsia="es-AR"/>
+        </w:rPr>
+        <w:t>Nro_Visita</w:t>
+      </w:r>
+      <w:proofErr w:type="spellEnd"/>
+      <w:r>
+        <w:rPr>
+          <w:rFonts w:ascii="Times New Roman" w:eastAsia="Times New Roman" w:hAnsi="Times New Roman" w:cs="Times New Roman"/>
+          <w:sz w:val="24"/>
+          <w:szCs w:val="24"/>
+          <w:lang w:eastAsia="es-AR"/>
+        </w:rPr>
+        <w:t xml:space="preserve"> (Clave Primaria inventada).</w:t>
+      </w:r>
+    </w:p>
+    <w:p>
+      <w:pPr>
+        <w:numPr>
+          <w:ilvl w:val="0"/>
+          <w:numId w:val="40"/>
+        </w:numPr>
+        <w:spacing w:before="100" w:beforeAutospacing="1" w:after="100" w:afterAutospacing="1" w:line="240" w:lineRule="auto"/>
+        <w:rPr>
+          <w:rFonts w:ascii="Times New Roman" w:eastAsia="Times New Roman" w:hAnsi="Times New Roman" w:cs="Times New Roman"/>
+          <w:sz w:val="24"/>
+          <w:szCs w:val="24"/>
+          <w:lang w:eastAsia="es-AR"/>
+        </w:rPr>
+      </w:pPr>
+      <w:r>
+        <w:rPr>
+          <w:rFonts w:ascii="Times New Roman" w:eastAsia="Times New Roman" w:hAnsi="Times New Roman" w:cs="Times New Roman"/>
+          <w:b/>
+          <w:bCs/>
+          <w:sz w:val="24"/>
+          <w:szCs w:val="24"/>
+          <w:lang w:eastAsia="es-AR"/>
+        </w:rPr>
+        <w:t>OPERACIONES:</w:t>
+      </w:r>
+      <w:r>
+        <w:rPr>
+          <w:rFonts w:ascii="Times New Roman" w:eastAsia="Times New Roman" w:hAnsi="Times New Roman" w:cs="Times New Roman"/>
+          <w:sz w:val="24"/>
+          <w:szCs w:val="24"/>
+          <w:lang w:eastAsia="es-AR"/>
+        </w:rPr>
+        <w:t xml:space="preserve"> Se debe proponer un </w:t>
+      </w:r>
+      <w:proofErr w:type="spellStart"/>
+      <w:r>
+        <w:rPr>
+          <w:rFonts w:ascii="Courier New" w:eastAsia="Times New Roman" w:hAnsi="Courier New" w:cs="Courier New"/>
+          <w:sz w:val="20"/>
+          <w:szCs w:val="20"/>
+          <w:lang w:eastAsia="es-AR"/>
+        </w:rPr>
+        <w:t>Nro_Operacion</w:t>
+      </w:r>
+      <w:proofErr w:type="spellEnd"/>
+      <w:r>
+        <w:rPr>
+          <w:rFonts w:ascii="Times New Roman" w:eastAsia="Times New Roman" w:hAnsi="Times New Roman" w:cs="Times New Roman"/>
+          <w:sz w:val="24"/>
+          <w:szCs w:val="24"/>
+          <w:lang w:eastAsia="es-AR"/>
+        </w:rPr>
+        <w:t xml:space="preserve"> (Clave Primaria inventada).</w:t>
+      </w:r>
+    </w:p>
+    <w:p>
+      <w:pPr>
+        <w:spacing w:before="100" w:beforeAutospacing="1" w:after="100" w:afterAutospacing="1" w:line="240" w:lineRule="auto"/>
+        <w:rPr>
+          <w:rFonts w:ascii="Times New Roman" w:eastAsia="Times New Roman" w:hAnsi="Times New Roman" w:cs="Times New Roman"/>
+          <w:sz w:val="24"/>
+          <w:szCs w:val="24"/>
+          <w:lang w:eastAsia="es-AR"/>
+        </w:rPr>
+      </w:pPr>
+      <w:r>
+        <w:rPr>
+          <w:rFonts w:ascii="Times New Roman" w:eastAsia="Times New Roman" w:hAnsi="Times New Roman" w:cs="Times New Roman"/>
+          <w:b/>
+          <w:bCs/>
+          <w:sz w:val="24"/>
+          <w:szCs w:val="24"/>
+          <w:lang w:eastAsia="es-AR"/>
+        </w:rPr>
+        <w:t>6. Propuestas de Mejoras (Análisis Crítico a redactar)</w:t>
+      </w:r>
+    </w:p>
+    <w:p>
+      <w:pPr>
+        <w:numPr>
+          <w:ilvl w:val="0"/>
+          <w:numId w:val="41"/>
+        </w:numPr>
+        <w:spacing w:before="100" w:beforeAutospacing="1" w:after="100" w:afterAutospacing="1" w:line="240" w:lineRule="auto"/>
+        <w:rPr>
+          <w:rFonts w:ascii="Times New Roman" w:eastAsia="Times New Roman" w:hAnsi="Times New Roman" w:cs="Times New Roman"/>
+          <w:sz w:val="24"/>
+          <w:szCs w:val="24"/>
+          <w:lang w:eastAsia="es-AR"/>
+        </w:rPr>
+      </w:pPr>
+      <w:r>
+        <w:rPr>
+          <w:rFonts w:ascii="Times New Roman" w:eastAsia="Times New Roman" w:hAnsi="Times New Roman" w:cs="Times New Roman"/>
+          <w:b/>
+          <w:bCs/>
+          <w:sz w:val="24"/>
+          <w:szCs w:val="24"/>
+          <w:lang w:eastAsia="es-AR"/>
+        </w:rPr>
+        <w:t>Incorporación de Identificadores (</w:t>
+      </w:r>
+      <w:proofErr w:type="spellStart"/>
+      <w:r>
+        <w:rPr>
+          <w:rFonts w:ascii="Times New Roman" w:eastAsia="Times New Roman" w:hAnsi="Times New Roman" w:cs="Times New Roman"/>
+          <w:b/>
+          <w:bCs/>
+          <w:sz w:val="24"/>
+          <w:szCs w:val="24"/>
+          <w:lang w:eastAsia="es-AR"/>
+        </w:rPr>
+        <w:t>PKs</w:t>
+      </w:r>
+      <w:proofErr w:type="spellEnd"/>
+      <w:r>
+        <w:rPr>
+          <w:rFonts w:ascii="Times New Roman" w:eastAsia="Times New Roman" w:hAnsi="Times New Roman" w:cs="Times New Roman"/>
+          <w:b/>
+          <w:bCs/>
+          <w:sz w:val="24"/>
+          <w:szCs w:val="24"/>
+          <w:lang w:eastAsia="es-AR"/>
+        </w:rPr>
+        <w:t>):</w:t>
+      </w:r>
+      <w:r>
+        <w:rPr>
+          <w:rFonts w:ascii="Times New Roman" w:eastAsia="Times New Roman" w:hAnsi="Times New Roman" w:cs="Times New Roman"/>
+          <w:sz w:val="24"/>
+          <w:szCs w:val="24"/>
+          <w:lang w:eastAsia="es-AR"/>
+        </w:rPr>
+        <w:t xml:space="preserve"> El enunciado no proporciona atributos clave para Visitas ni Operaciones. Es mandatorio inventar </w:t>
+      </w:r>
+      <w:proofErr w:type="spellStart"/>
+      <w:r>
+        <w:rPr>
+          <w:rFonts w:ascii="Courier New" w:eastAsia="Times New Roman" w:hAnsi="Courier New" w:cs="Courier New"/>
+          <w:sz w:val="20"/>
+          <w:szCs w:val="20"/>
+          <w:lang w:eastAsia="es-AR"/>
+        </w:rPr>
+        <w:t>Nro_Visita</w:t>
+      </w:r>
+      <w:proofErr w:type="spellEnd"/>
+      <w:r>
+        <w:rPr>
+          <w:rFonts w:ascii="Times New Roman" w:eastAsia="Times New Roman" w:hAnsi="Times New Roman" w:cs="Times New Roman"/>
+          <w:sz w:val="24"/>
+          <w:szCs w:val="24"/>
+          <w:lang w:eastAsia="es-AR"/>
+        </w:rPr>
+        <w:t xml:space="preserve"> y </w:t>
+      </w:r>
+      <w:proofErr w:type="spellStart"/>
+      <w:r>
+        <w:rPr>
+          <w:rFonts w:ascii="Courier New" w:eastAsia="Times New Roman" w:hAnsi="Courier New" w:cs="Courier New"/>
+          <w:sz w:val="20"/>
+          <w:szCs w:val="20"/>
+          <w:lang w:eastAsia="es-AR"/>
+        </w:rPr>
+        <w:t>Nro_Operacion</w:t>
+      </w:r>
+      <w:proofErr w:type="spellEnd"/>
+      <w:r>
+        <w:rPr>
+          <w:rFonts w:ascii="Times New Roman" w:eastAsia="Times New Roman" w:hAnsi="Times New Roman" w:cs="Times New Roman"/>
+          <w:sz w:val="24"/>
+          <w:szCs w:val="24"/>
+          <w:lang w:eastAsia="es-AR"/>
+        </w:rPr>
+        <w:t>. De lo contrario, habría que usar claves compuestas ineficientes (ej. DNI Cliente + DNI Agente + ID Propiedad + Fecha + Hora).</w:t>
+      </w:r>
+    </w:p>
+    <w:p>
+      <w:pPr>
+        <w:numPr>
+          <w:ilvl w:val="0"/>
+          <w:numId w:val="41"/>
+        </w:numPr>
+        <w:spacing w:before="100" w:beforeAutospacing="1" w:after="100" w:afterAutospacing="1" w:line="240" w:lineRule="auto"/>
+        <w:rPr>
+          <w:rFonts w:ascii="Times New Roman" w:eastAsia="Times New Roman" w:hAnsi="Times New Roman" w:cs="Times New Roman"/>
+          <w:sz w:val="24"/>
+          <w:szCs w:val="24"/>
+          <w:lang w:eastAsia="es-AR"/>
+        </w:rPr>
+      </w:pPr>
+      <w:r>
+        <w:rPr>
+          <w:rFonts w:ascii="Times New Roman" w:eastAsia="Times New Roman" w:hAnsi="Times New Roman" w:cs="Times New Roman"/>
+          <w:b/>
+          <w:bCs/>
+          <w:sz w:val="24"/>
+          <w:szCs w:val="24"/>
+          <w:lang w:eastAsia="es-AR"/>
+        </w:rPr>
+        <w:t>Atributos de Preferencias como Entidades:</w:t>
+      </w:r>
+      <w:r>
+        <w:rPr>
+          <w:rFonts w:ascii="Times New Roman" w:eastAsia="Times New Roman" w:hAnsi="Times New Roman" w:cs="Times New Roman"/>
+          <w:sz w:val="24"/>
+          <w:szCs w:val="24"/>
+          <w:lang w:eastAsia="es-AR"/>
+        </w:rPr>
+        <w:t xml:space="preserve"> Al igual que pasó con el "Tipo de Propiedad" en el primer objetivo, la "zona" y el "tipo de propiedad buscada" del Cliente Interesado deberían ser entidades paramétricas para asegurar la normalización.</w:t>
+      </w:r>
+    </w:p>
+    <w:p>
+      <w:pPr>
+        <w:numPr>
+          <w:ilvl w:val="0"/>
+          <w:numId w:val="41"/>
+        </w:numPr>
+        <w:spacing w:before="100" w:beforeAutospacing="1" w:after="100" w:afterAutospacing="1" w:line="240" w:lineRule="auto"/>
+        <w:rPr>
+          <w:rFonts w:ascii="Times New Roman" w:eastAsia="Times New Roman" w:hAnsi="Times New Roman" w:cs="Times New Roman"/>
+          <w:sz w:val="24"/>
+          <w:szCs w:val="24"/>
+          <w:lang w:eastAsia="es-AR"/>
+        </w:rPr>
+      </w:pPr>
+      <w:r>
+        <w:rPr>
+          <w:rFonts w:ascii="Times New Roman" w:eastAsia="Times New Roman" w:hAnsi="Times New Roman" w:cs="Times New Roman"/>
+          <w:b/>
+          <w:bCs/>
+          <w:sz w:val="24"/>
+          <w:szCs w:val="24"/>
+          <w:lang w:eastAsia="es-AR"/>
+        </w:rPr>
+        <w:t>Regla de Negocio (Disponibilidad):</w:t>
+      </w:r>
+      <w:r>
+        <w:rPr>
+          <w:rFonts w:ascii="Times New Roman" w:eastAsia="Times New Roman" w:hAnsi="Times New Roman" w:cs="Times New Roman"/>
+          <w:sz w:val="24"/>
+          <w:szCs w:val="24"/>
+          <w:lang w:eastAsia="es-AR"/>
+        </w:rPr>
+        <w:t xml:space="preserve"> La restricción del enunciado </w:t>
+      </w:r>
+      <w:r>
+        <w:rPr>
+          <w:rFonts w:ascii="Times New Roman" w:eastAsia="Times New Roman" w:hAnsi="Times New Roman" w:cs="Times New Roman"/>
+          <w:i/>
+          <w:iCs/>
+          <w:sz w:val="24"/>
+          <w:szCs w:val="24"/>
+          <w:lang w:eastAsia="es-AR"/>
+        </w:rPr>
+        <w:t>"Al registrar una operación, el estado de la propiedad debe cambiar a No disponible"</w:t>
+      </w:r>
+      <w:r>
+        <w:rPr>
+          <w:rFonts w:ascii="Times New Roman" w:eastAsia="Times New Roman" w:hAnsi="Times New Roman" w:cs="Times New Roman"/>
+          <w:sz w:val="24"/>
+          <w:szCs w:val="24"/>
+          <w:lang w:eastAsia="es-AR"/>
+        </w:rPr>
+        <w:t xml:space="preserve"> </w:t>
+      </w:r>
+      <w:r>
+        <w:rPr>
+          <w:rFonts w:ascii="Times New Roman" w:eastAsia="Times New Roman" w:hAnsi="Times New Roman" w:cs="Times New Roman"/>
+          <w:b/>
+          <w:bCs/>
+          <w:sz w:val="24"/>
+          <w:szCs w:val="24"/>
+          <w:lang w:eastAsia="es-AR"/>
+        </w:rPr>
+        <w:t>no se dibuja en el DER</w:t>
+      </w:r>
+      <w:r>
+        <w:rPr>
+          <w:rFonts w:ascii="Times New Roman" w:eastAsia="Times New Roman" w:hAnsi="Times New Roman" w:cs="Times New Roman"/>
+          <w:sz w:val="24"/>
+          <w:szCs w:val="24"/>
+          <w:lang w:eastAsia="es-AR"/>
+        </w:rPr>
+        <w:t xml:space="preserve">. En el modelo conceptual estático, esta acción dinámica se documenta como una "Regla de Negocio" que, a futuro, se implementará mediante un </w:t>
+      </w:r>
+      <w:proofErr w:type="spellStart"/>
+      <w:r>
+        <w:rPr>
+          <w:rFonts w:ascii="Times New Roman" w:eastAsia="Times New Roman" w:hAnsi="Times New Roman" w:cs="Times New Roman"/>
+          <w:i/>
+          <w:iCs/>
+          <w:sz w:val="24"/>
+          <w:szCs w:val="24"/>
+          <w:lang w:eastAsia="es-AR"/>
+        </w:rPr>
+        <w:t>Trigger</w:t>
+      </w:r>
+      <w:proofErr w:type="spellEnd"/>
+      <w:r>
+        <w:rPr>
+          <w:rFonts w:ascii="Times New Roman" w:eastAsia="Times New Roman" w:hAnsi="Times New Roman" w:cs="Times New Roman"/>
+          <w:sz w:val="24"/>
+          <w:szCs w:val="24"/>
+          <w:lang w:eastAsia="es-AR"/>
+        </w:rPr>
+        <w:t xml:space="preserve"> (Disparador) o procedimiento almacenado en el motor de la base de datos relacional.</w:t>
+      </w:r>
+    </w:p>
+    <w:p>
+      <w:pPr>
+        <w:pStyle w:val="NormalWeb"/>
+      </w:pPr>
     </w:p>
     <w:p/>
     <w:sectPr>
@@ -3461,6 +5261,155 @@
     </w:lvl>
   </w:abstractNum>
   <w:abstractNum w:abstractNumId="5" w15:restartNumberingAfterBreak="0">
+    <w:nsid w:val="14633FF2"/>
+    <w:multiLevelType w:val="multilevel"/>
+    <w:tmpl w:val="CF044C7E"/>
+    <w:lvl w:ilvl="0">
+      <w:start w:val="1"/>
+      <w:numFmt w:val="bullet"/>
+      <w:lvlText w:val=""/>
+      <w:lvlJc w:val="left"/>
+      <w:pPr>
+        <w:tabs>
+          <w:tab w:val="num" w:pos="720"/>
+        </w:tabs>
+        <w:ind w:left="720" w:hanging="360"/>
+      </w:pPr>
+      <w:rPr>
+        <w:rFonts w:ascii="Symbol" w:hAnsi="Symbol" w:hint="default"/>
+        <w:sz w:val="20"/>
+      </w:rPr>
+    </w:lvl>
+    <w:lvl w:ilvl="1">
+      <w:start w:val="1"/>
+      <w:numFmt w:val="bullet"/>
+      <w:lvlText w:val="o"/>
+      <w:lvlJc w:val="left"/>
+      <w:pPr>
+        <w:tabs>
+          <w:tab w:val="num" w:pos="1440"/>
+        </w:tabs>
+        <w:ind w:left="1440" w:hanging="360"/>
+      </w:pPr>
+      <w:rPr>
+        <w:rFonts w:ascii="Courier New" w:hAnsi="Courier New" w:hint="default"/>
+        <w:sz w:val="20"/>
+      </w:rPr>
+    </w:lvl>
+    <w:lvl w:ilvl="2" w:tentative="1">
+      <w:start w:val="1"/>
+      <w:numFmt w:val="bullet"/>
+      <w:lvlText w:val=""/>
+      <w:lvlJc w:val="left"/>
+      <w:pPr>
+        <w:tabs>
+          <w:tab w:val="num" w:pos="2160"/>
+        </w:tabs>
+        <w:ind w:left="2160" w:hanging="360"/>
+      </w:pPr>
+      <w:rPr>
+        <w:rFonts w:ascii="Wingdings" w:hAnsi="Wingdings" w:hint="default"/>
+        <w:sz w:val="20"/>
+      </w:rPr>
+    </w:lvl>
+    <w:lvl w:ilvl="3" w:tentative="1">
+      <w:start w:val="1"/>
+      <w:numFmt w:val="bullet"/>
+      <w:lvlText w:val=""/>
+      <w:lvlJc w:val="left"/>
+      <w:pPr>
+        <w:tabs>
+          <w:tab w:val="num" w:pos="2880"/>
+        </w:tabs>
+        <w:ind w:left="2880" w:hanging="360"/>
+      </w:pPr>
+      <w:rPr>
+        <w:rFonts w:ascii="Wingdings" w:hAnsi="Wingdings" w:hint="default"/>
+        <w:sz w:val="20"/>
+      </w:rPr>
+    </w:lvl>
+    <w:lvl w:ilvl="4" w:tentative="1">
+      <w:start w:val="1"/>
+      <w:numFmt w:val="bullet"/>
+      <w:lvlText w:val=""/>
+      <w:lvlJc w:val="left"/>
+      <w:pPr>
+        <w:tabs>
+          <w:tab w:val="num" w:pos="3600"/>
+        </w:tabs>
+        <w:ind w:left="3600" w:hanging="360"/>
+      </w:pPr>
+      <w:rPr>
+        <w:rFonts w:ascii="Wingdings" w:hAnsi="Wingdings" w:hint="default"/>
+        <w:sz w:val="20"/>
+      </w:rPr>
+    </w:lvl>
+    <w:lvl w:ilvl="5" w:tentative="1">
+      <w:start w:val="1"/>
+      <w:numFmt w:val="bullet"/>
+      <w:lvlText w:val=""/>
+      <w:lvlJc w:val="left"/>
+      <w:pPr>
+        <w:tabs>
+          <w:tab w:val="num" w:pos="4320"/>
+        </w:tabs>
+        <w:ind w:left="4320" w:hanging="360"/>
+      </w:pPr>
+      <w:rPr>
+        <w:rFonts w:ascii="Wingdings" w:hAnsi="Wingdings" w:hint="default"/>
+        <w:sz w:val="20"/>
+      </w:rPr>
+    </w:lvl>
+    <w:lvl w:ilvl="6" w:tentative="1">
+      <w:start w:val="1"/>
+      <w:numFmt w:val="bullet"/>
+      <w:lvlText w:val=""/>
+      <w:lvlJc w:val="left"/>
+      <w:pPr>
+        <w:tabs>
+          <w:tab w:val="num" w:pos="5040"/>
+        </w:tabs>
+        <w:ind w:left="5040" w:hanging="360"/>
+      </w:pPr>
+      <w:rPr>
+        <w:rFonts w:ascii="Wingdings" w:hAnsi="Wingdings" w:hint="default"/>
+        <w:sz w:val="20"/>
+      </w:rPr>
+    </w:lvl>
+    <w:lvl w:ilvl="7" w:tentative="1">
+      <w:start w:val="1"/>
+      <w:numFmt w:val="bullet"/>
+      <w:lvlText w:val=""/>
+      <w:lvlJc w:val="left"/>
+      <w:pPr>
+        <w:tabs>
+          <w:tab w:val="num" w:pos="5760"/>
+        </w:tabs>
+        <w:ind w:left="5760" w:hanging="360"/>
+      </w:pPr>
+      <w:rPr>
+        <w:rFonts w:ascii="Wingdings" w:hAnsi="Wingdings" w:hint="default"/>
+        <w:sz w:val="20"/>
+      </w:rPr>
+    </w:lvl>
+    <w:lvl w:ilvl="8" w:tentative="1">
+      <w:start w:val="1"/>
+      <w:numFmt w:val="bullet"/>
+      <w:lvlText w:val=""/>
+      <w:lvlJc w:val="left"/>
+      <w:pPr>
+        <w:tabs>
+          <w:tab w:val="num" w:pos="6480"/>
+        </w:tabs>
+        <w:ind w:left="6480" w:hanging="360"/>
+      </w:pPr>
+      <w:rPr>
+        <w:rFonts w:ascii="Wingdings" w:hAnsi="Wingdings" w:hint="default"/>
+        <w:sz w:val="20"/>
+      </w:rPr>
+    </w:lvl>
+  </w:abstractNum>
+  <w:abstractNum w:abstractNumId="6" w15:restartNumberingAfterBreak="0">
     <w:nsid w:val="19550468"/>
     <w:multiLevelType w:val="multilevel"/>
     <w:tmpl w:val="8BF6E9E2"/>
@@ -3609,7 +5558,7 @@
       </w:rPr>
     </w:lvl>
   </w:abstractNum>
-  <w:abstractNum w:abstractNumId="6" w15:restartNumberingAfterBreak="0">
+  <w:abstractNum w:abstractNumId="7" w15:restartNumberingAfterBreak="0">
     <w:nsid w:val="1D557256"/>
     <w:multiLevelType w:val="multilevel"/>
     <w:tmpl w:val="415E42AC"/>
@@ -3758,7 +5707,7 @@
       </w:rPr>
     </w:lvl>
   </w:abstractNum>
-  <w:abstractNum w:abstractNumId="7" w15:restartNumberingAfterBreak="0">
+  <w:abstractNum w:abstractNumId="8" w15:restartNumberingAfterBreak="0">
     <w:nsid w:val="1EC63F2A"/>
     <w:multiLevelType w:val="multilevel"/>
     <w:tmpl w:val="E3E6ACE8"/>
@@ -3907,7 +5856,7 @@
       </w:rPr>
     </w:lvl>
   </w:abstractNum>
-  <w:abstractNum w:abstractNumId="8" w15:restartNumberingAfterBreak="0">
+  <w:abstractNum w:abstractNumId="9" w15:restartNumberingAfterBreak="0">
     <w:nsid w:val="2374520E"/>
     <w:multiLevelType w:val="multilevel"/>
     <w:tmpl w:val="425C10B2"/>
@@ -4056,7 +6005,156 @@
       </w:rPr>
     </w:lvl>
   </w:abstractNum>
-  <w:abstractNum w:abstractNumId="9" w15:restartNumberingAfterBreak="0">
+  <w:abstractNum w:abstractNumId="10" w15:restartNumberingAfterBreak="0">
+    <w:nsid w:val="237B5DE8"/>
+    <w:multiLevelType w:val="multilevel"/>
+    <w:tmpl w:val="89121FA2"/>
+    <w:lvl w:ilvl="0">
+      <w:start w:val="1"/>
+      <w:numFmt w:val="bullet"/>
+      <w:lvlText w:val=""/>
+      <w:lvlJc w:val="left"/>
+      <w:pPr>
+        <w:tabs>
+          <w:tab w:val="num" w:pos="720"/>
+        </w:tabs>
+        <w:ind w:left="720" w:hanging="360"/>
+      </w:pPr>
+      <w:rPr>
+        <w:rFonts w:ascii="Symbol" w:hAnsi="Symbol" w:hint="default"/>
+        <w:sz w:val="20"/>
+      </w:rPr>
+    </w:lvl>
+    <w:lvl w:ilvl="1" w:tentative="1">
+      <w:start w:val="1"/>
+      <w:numFmt w:val="bullet"/>
+      <w:lvlText w:val="o"/>
+      <w:lvlJc w:val="left"/>
+      <w:pPr>
+        <w:tabs>
+          <w:tab w:val="num" w:pos="1440"/>
+        </w:tabs>
+        <w:ind w:left="1440" w:hanging="360"/>
+      </w:pPr>
+      <w:rPr>
+        <w:rFonts w:ascii="Courier New" w:hAnsi="Courier New" w:hint="default"/>
+        <w:sz w:val="20"/>
+      </w:rPr>
+    </w:lvl>
+    <w:lvl w:ilvl="2" w:tentative="1">
+      <w:start w:val="1"/>
+      <w:numFmt w:val="bullet"/>
+      <w:lvlText w:val=""/>
+      <w:lvlJc w:val="left"/>
+      <w:pPr>
+        <w:tabs>
+          <w:tab w:val="num" w:pos="2160"/>
+        </w:tabs>
+        <w:ind w:left="2160" w:hanging="360"/>
+      </w:pPr>
+      <w:rPr>
+        <w:rFonts w:ascii="Wingdings" w:hAnsi="Wingdings" w:hint="default"/>
+        <w:sz w:val="20"/>
+      </w:rPr>
+    </w:lvl>
+    <w:lvl w:ilvl="3" w:tentative="1">
+      <w:start w:val="1"/>
+      <w:numFmt w:val="bullet"/>
+      <w:lvlText w:val=""/>
+      <w:lvlJc w:val="left"/>
+      <w:pPr>
+        <w:tabs>
+          <w:tab w:val="num" w:pos="2880"/>
+        </w:tabs>
+        <w:ind w:left="2880" w:hanging="360"/>
+      </w:pPr>
+      <w:rPr>
+        <w:rFonts w:ascii="Wingdings" w:hAnsi="Wingdings" w:hint="default"/>
+        <w:sz w:val="20"/>
+      </w:rPr>
+    </w:lvl>
+    <w:lvl w:ilvl="4" w:tentative="1">
+      <w:start w:val="1"/>
+      <w:numFmt w:val="bullet"/>
+      <w:lvlText w:val=""/>
+      <w:lvlJc w:val="left"/>
+      <w:pPr>
+        <w:tabs>
+          <w:tab w:val="num" w:pos="3600"/>
+        </w:tabs>
+        <w:ind w:left="3600" w:hanging="360"/>
+      </w:pPr>
+      <w:rPr>
+        <w:rFonts w:ascii="Wingdings" w:hAnsi="Wingdings" w:hint="default"/>
+        <w:sz w:val="20"/>
+      </w:rPr>
+    </w:lvl>
+    <w:lvl w:ilvl="5" w:tentative="1">
+      <w:start w:val="1"/>
+      <w:numFmt w:val="bullet"/>
+      <w:lvlText w:val=""/>
+      <w:lvlJc w:val="left"/>
+      <w:pPr>
+        <w:tabs>
+          <w:tab w:val="num" w:pos="4320"/>
+        </w:tabs>
+        <w:ind w:left="4320" w:hanging="360"/>
+      </w:pPr>
+      <w:rPr>
+        <w:rFonts w:ascii="Wingdings" w:hAnsi="Wingdings" w:hint="default"/>
+        <w:sz w:val="20"/>
+      </w:rPr>
+    </w:lvl>
+    <w:lvl w:ilvl="6" w:tentative="1">
+      <w:start w:val="1"/>
+      <w:numFmt w:val="bullet"/>
+      <w:lvlText w:val=""/>
+      <w:lvlJc w:val="left"/>
+      <w:pPr>
+        <w:tabs>
+          <w:tab w:val="num" w:pos="5040"/>
+        </w:tabs>
+        <w:ind w:left="5040" w:hanging="360"/>
+      </w:pPr>
+      <w:rPr>
+        <w:rFonts w:ascii="Wingdings" w:hAnsi="Wingdings" w:hint="default"/>
+        <w:sz w:val="20"/>
+      </w:rPr>
+    </w:lvl>
+    <w:lvl w:ilvl="7" w:tentative="1">
+      <w:start w:val="1"/>
+      <w:numFmt w:val="bullet"/>
+      <w:lvlText w:val=""/>
+      <w:lvlJc w:val="left"/>
+      <w:pPr>
+        <w:tabs>
+          <w:tab w:val="num" w:pos="5760"/>
+        </w:tabs>
+        <w:ind w:left="5760" w:hanging="360"/>
+      </w:pPr>
+      <w:rPr>
+        <w:rFonts w:ascii="Wingdings" w:hAnsi="Wingdings" w:hint="default"/>
+        <w:sz w:val="20"/>
+      </w:rPr>
+    </w:lvl>
+    <w:lvl w:ilvl="8" w:tentative="1">
+      <w:start w:val="1"/>
+      <w:numFmt w:val="bullet"/>
+      <w:lvlText w:val=""/>
+      <w:lvlJc w:val="left"/>
+      <w:pPr>
+        <w:tabs>
+          <w:tab w:val="num" w:pos="6480"/>
+        </w:tabs>
+        <w:ind w:left="6480" w:hanging="360"/>
+      </w:pPr>
+      <w:rPr>
+        <w:rFonts w:ascii="Wingdings" w:hAnsi="Wingdings" w:hint="default"/>
+        <w:sz w:val="20"/>
+      </w:rPr>
+    </w:lvl>
+  </w:abstractNum>
+  <w:abstractNum w:abstractNumId="11" w15:restartNumberingAfterBreak="0">
     <w:nsid w:val="25264E79"/>
     <w:multiLevelType w:val="multilevel"/>
     <w:tmpl w:val="5792CE10"/>
@@ -4205,7 +6303,7 @@
       </w:rPr>
     </w:lvl>
   </w:abstractNum>
-  <w:abstractNum w:abstractNumId="10" w15:restartNumberingAfterBreak="0">
+  <w:abstractNum w:abstractNumId="12" w15:restartNumberingAfterBreak="0">
     <w:nsid w:val="255320F1"/>
     <w:multiLevelType w:val="multilevel"/>
     <w:tmpl w:val="CA9A069C"/>
@@ -4354,7 +6452,7 @@
       </w:rPr>
     </w:lvl>
   </w:abstractNum>
-  <w:abstractNum w:abstractNumId="11" w15:restartNumberingAfterBreak="0">
+  <w:abstractNum w:abstractNumId="13" w15:restartNumberingAfterBreak="0">
     <w:nsid w:val="26594C06"/>
     <w:multiLevelType w:val="multilevel"/>
     <w:tmpl w:val="91EC89AC"/>
@@ -4503,7 +6601,156 @@
       </w:rPr>
     </w:lvl>
   </w:abstractNum>
-  <w:abstractNum w:abstractNumId="12" w15:restartNumberingAfterBreak="0">
+  <w:abstractNum w:abstractNumId="14" w15:restartNumberingAfterBreak="0">
+    <w:nsid w:val="28994144"/>
+    <w:multiLevelType w:val="multilevel"/>
+    <w:tmpl w:val="17F0A5F6"/>
+    <w:lvl w:ilvl="0">
+      <w:start w:val="1"/>
+      <w:numFmt w:val="bullet"/>
+      <w:lvlText w:val=""/>
+      <w:lvlJc w:val="left"/>
+      <w:pPr>
+        <w:tabs>
+          <w:tab w:val="num" w:pos="720"/>
+        </w:tabs>
+        <w:ind w:left="720" w:hanging="360"/>
+      </w:pPr>
+      <w:rPr>
+        <w:rFonts w:ascii="Symbol" w:hAnsi="Symbol" w:hint="default"/>
+        <w:sz w:val="20"/>
+      </w:rPr>
+    </w:lvl>
+    <w:lvl w:ilvl="1" w:tentative="1">
+      <w:start w:val="1"/>
+      <w:numFmt w:val="bullet"/>
+      <w:lvlText w:val="o"/>
+      <w:lvlJc w:val="left"/>
+      <w:pPr>
+        <w:tabs>
+          <w:tab w:val="num" w:pos="1440"/>
+        </w:tabs>
+        <w:ind w:left="1440" w:hanging="360"/>
+      </w:pPr>
+      <w:rPr>
+        <w:rFonts w:ascii="Courier New" w:hAnsi="Courier New" w:hint="default"/>
+        <w:sz w:val="20"/>
+      </w:rPr>
+    </w:lvl>
+    <w:lvl w:ilvl="2" w:tentative="1">
+      <w:start w:val="1"/>
+      <w:numFmt w:val="bullet"/>
+      <w:lvlText w:val=""/>
+      <w:lvlJc w:val="left"/>
+      <w:pPr>
+        <w:tabs>
+          <w:tab w:val="num" w:pos="2160"/>
+        </w:tabs>
+        <w:ind w:left="2160" w:hanging="360"/>
+      </w:pPr>
+      <w:rPr>
+        <w:rFonts w:ascii="Wingdings" w:hAnsi="Wingdings" w:hint="default"/>
+        <w:sz w:val="20"/>
+      </w:rPr>
+    </w:lvl>
+    <w:lvl w:ilvl="3" w:tentative="1">
+      <w:start w:val="1"/>
+      <w:numFmt w:val="bullet"/>
+      <w:lvlText w:val=""/>
+      <w:lvlJc w:val="left"/>
+      <w:pPr>
+        <w:tabs>
+          <w:tab w:val="num" w:pos="2880"/>
+        </w:tabs>
+        <w:ind w:left="2880" w:hanging="360"/>
+      </w:pPr>
+      <w:rPr>
+        <w:rFonts w:ascii="Wingdings" w:hAnsi="Wingdings" w:hint="default"/>
+        <w:sz w:val="20"/>
+      </w:rPr>
+    </w:lvl>
+    <w:lvl w:ilvl="4" w:tentative="1">
+      <w:start w:val="1"/>
+      <w:numFmt w:val="bullet"/>
+      <w:lvlText w:val=""/>
+      <w:lvlJc w:val="left"/>
+      <w:pPr>
+        <w:tabs>
+          <w:tab w:val="num" w:pos="3600"/>
+        </w:tabs>
+        <w:ind w:left="3600" w:hanging="360"/>
+      </w:pPr>
+      <w:rPr>
+        <w:rFonts w:ascii="Wingdings" w:hAnsi="Wingdings" w:hint="default"/>
+        <w:sz w:val="20"/>
+      </w:rPr>
+    </w:lvl>
+    <w:lvl w:ilvl="5" w:tentative="1">
+      <w:start w:val="1"/>
+      <w:numFmt w:val="bullet"/>
+      <w:lvlText w:val=""/>
+      <w:lvlJc w:val="left"/>
+      <w:pPr>
+        <w:tabs>
+          <w:tab w:val="num" w:pos="4320"/>
+        </w:tabs>
+        <w:ind w:left="4320" w:hanging="360"/>
+      </w:pPr>
+      <w:rPr>
+        <w:rFonts w:ascii="Wingdings" w:hAnsi="Wingdings" w:hint="default"/>
+        <w:sz w:val="20"/>
+      </w:rPr>
+    </w:lvl>
+    <w:lvl w:ilvl="6" w:tentative="1">
+      <w:start w:val="1"/>
+      <w:numFmt w:val="bullet"/>
+      <w:lvlText w:val=""/>
+      <w:lvlJc w:val="left"/>
+      <w:pPr>
+        <w:tabs>
+          <w:tab w:val="num" w:pos="5040"/>
+        </w:tabs>
+        <w:ind w:left="5040" w:hanging="360"/>
+      </w:pPr>
+      <w:rPr>
+        <w:rFonts w:ascii="Wingdings" w:hAnsi="Wingdings" w:hint="default"/>
+        <w:sz w:val="20"/>
+      </w:rPr>
+    </w:lvl>
+    <w:lvl w:ilvl="7" w:tentative="1">
+      <w:start w:val="1"/>
+      <w:numFmt w:val="bullet"/>
+      <w:lvlText w:val=""/>
+      <w:lvlJc w:val="left"/>
+      <w:pPr>
+        <w:tabs>
+          <w:tab w:val="num" w:pos="5760"/>
+        </w:tabs>
+        <w:ind w:left="5760" w:hanging="360"/>
+      </w:pPr>
+      <w:rPr>
+        <w:rFonts w:ascii="Wingdings" w:hAnsi="Wingdings" w:hint="default"/>
+        <w:sz w:val="20"/>
+      </w:rPr>
+    </w:lvl>
+    <w:lvl w:ilvl="8" w:tentative="1">
+      <w:start w:val="1"/>
+      <w:numFmt w:val="bullet"/>
+      <w:lvlText w:val=""/>
+      <w:lvlJc w:val="left"/>
+      <w:pPr>
+        <w:tabs>
+          <w:tab w:val="num" w:pos="6480"/>
+        </w:tabs>
+        <w:ind w:left="6480" w:hanging="360"/>
+      </w:pPr>
+      <w:rPr>
+        <w:rFonts w:ascii="Wingdings" w:hAnsi="Wingdings" w:hint="default"/>
+        <w:sz w:val="20"/>
+      </w:rPr>
+    </w:lvl>
+  </w:abstractNum>
+  <w:abstractNum w:abstractNumId="15" w15:restartNumberingAfterBreak="0">
     <w:nsid w:val="2DC80D3F"/>
     <w:multiLevelType w:val="multilevel"/>
     <w:tmpl w:val="C5F4C888"/>
@@ -4652,7 +6899,7 @@
       </w:rPr>
     </w:lvl>
   </w:abstractNum>
-  <w:abstractNum w:abstractNumId="13" w15:restartNumberingAfterBreak="0">
+  <w:abstractNum w:abstractNumId="16" w15:restartNumberingAfterBreak="0">
     <w:nsid w:val="2F5A5F24"/>
     <w:multiLevelType w:val="multilevel"/>
     <w:tmpl w:val="61CA0764"/>
@@ -4801,7 +7048,7 @@
       </w:rPr>
     </w:lvl>
   </w:abstractNum>
-  <w:abstractNum w:abstractNumId="14" w15:restartNumberingAfterBreak="0">
+  <w:abstractNum w:abstractNumId="17" w15:restartNumberingAfterBreak="0">
     <w:nsid w:val="32CD1BEF"/>
     <w:multiLevelType w:val="multilevel"/>
     <w:tmpl w:val="91ECA8D2"/>
@@ -4950,7 +7197,7 @@
       </w:rPr>
     </w:lvl>
   </w:abstractNum>
-  <w:abstractNum w:abstractNumId="15" w15:restartNumberingAfterBreak="0">
+  <w:abstractNum w:abstractNumId="18" w15:restartNumberingAfterBreak="0">
     <w:nsid w:val="332437F9"/>
     <w:multiLevelType w:val="multilevel"/>
     <w:tmpl w:val="01161668"/>
@@ -5099,7 +7346,7 @@
       </w:rPr>
     </w:lvl>
   </w:abstractNum>
-  <w:abstractNum w:abstractNumId="16" w15:restartNumberingAfterBreak="0">
+  <w:abstractNum w:abstractNumId="19" w15:restartNumberingAfterBreak="0">
     <w:nsid w:val="38985706"/>
     <w:multiLevelType w:val="multilevel"/>
     <w:tmpl w:val="86D66306"/>
@@ -5248,7 +7495,7 @@
       </w:rPr>
     </w:lvl>
   </w:abstractNum>
-  <w:abstractNum w:abstractNumId="17" w15:restartNumberingAfterBreak="0">
+  <w:abstractNum w:abstractNumId="20" w15:restartNumberingAfterBreak="0">
     <w:nsid w:val="3B740291"/>
     <w:multiLevelType w:val="multilevel"/>
     <w:tmpl w:val="5906AFEC"/>
@@ -5397,7 +7644,7 @@
       </w:rPr>
     </w:lvl>
   </w:abstractNum>
-  <w:abstractNum w:abstractNumId="18" w15:restartNumberingAfterBreak="0">
+  <w:abstractNum w:abstractNumId="21" w15:restartNumberingAfterBreak="0">
     <w:nsid w:val="400F352D"/>
     <w:multiLevelType w:val="multilevel"/>
     <w:tmpl w:val="6D5CC04A"/>
@@ -5546,7 +7793,7 @@
       </w:rPr>
     </w:lvl>
   </w:abstractNum>
-  <w:abstractNum w:abstractNumId="19" w15:restartNumberingAfterBreak="0">
+  <w:abstractNum w:abstractNumId="22" w15:restartNumberingAfterBreak="0">
     <w:nsid w:val="4078019A"/>
     <w:multiLevelType w:val="multilevel"/>
     <w:tmpl w:val="61BA90B4"/>
@@ -5695,7 +7942,156 @@
       </w:rPr>
     </w:lvl>
   </w:abstractNum>
-  <w:abstractNum w:abstractNumId="20" w15:restartNumberingAfterBreak="0">
+  <w:abstractNum w:abstractNumId="23" w15:restartNumberingAfterBreak="0">
+    <w:nsid w:val="41EC2F43"/>
+    <w:multiLevelType w:val="multilevel"/>
+    <w:tmpl w:val="CA9A211A"/>
+    <w:lvl w:ilvl="0">
+      <w:start w:val="1"/>
+      <w:numFmt w:val="bullet"/>
+      <w:lvlText w:val=""/>
+      <w:lvlJc w:val="left"/>
+      <w:pPr>
+        <w:tabs>
+          <w:tab w:val="num" w:pos="720"/>
+        </w:tabs>
+        <w:ind w:left="720" w:hanging="360"/>
+      </w:pPr>
+      <w:rPr>
+        <w:rFonts w:ascii="Symbol" w:hAnsi="Symbol" w:hint="default"/>
+        <w:sz w:val="20"/>
+      </w:rPr>
+    </w:lvl>
+    <w:lvl w:ilvl="1">
+      <w:start w:val="1"/>
+      <w:numFmt w:val="bullet"/>
+      <w:lvlText w:val="o"/>
+      <w:lvlJc w:val="left"/>
+      <w:pPr>
+        <w:tabs>
+          <w:tab w:val="num" w:pos="1440"/>
+        </w:tabs>
+        <w:ind w:left="1440" w:hanging="360"/>
+      </w:pPr>
+      <w:rPr>
+        <w:rFonts w:ascii="Courier New" w:hAnsi="Courier New" w:hint="default"/>
+        <w:sz w:val="20"/>
+      </w:rPr>
+    </w:lvl>
+    <w:lvl w:ilvl="2" w:tentative="1">
+      <w:start w:val="1"/>
+      <w:numFmt w:val="bullet"/>
+      <w:lvlText w:val=""/>
+      <w:lvlJc w:val="left"/>
+      <w:pPr>
+        <w:tabs>
+          <w:tab w:val="num" w:pos="2160"/>
+        </w:tabs>
+        <w:ind w:left="2160" w:hanging="360"/>
+      </w:pPr>
+      <w:rPr>
+        <w:rFonts w:ascii="Wingdings" w:hAnsi="Wingdings" w:hint="default"/>
+        <w:sz w:val="20"/>
+      </w:rPr>
+    </w:lvl>
+    <w:lvl w:ilvl="3" w:tentative="1">
+      <w:start w:val="1"/>
+      <w:numFmt w:val="bullet"/>
+      <w:lvlText w:val=""/>
+      <w:lvlJc w:val="left"/>
+      <w:pPr>
+        <w:tabs>
+          <w:tab w:val="num" w:pos="2880"/>
+        </w:tabs>
+        <w:ind w:left="2880" w:hanging="360"/>
+      </w:pPr>
+      <w:rPr>
+        <w:rFonts w:ascii="Wingdings" w:hAnsi="Wingdings" w:hint="default"/>
+        <w:sz w:val="20"/>
+      </w:rPr>
+    </w:lvl>
+    <w:lvl w:ilvl="4" w:tentative="1">
+      <w:start w:val="1"/>
+      <w:numFmt w:val="bullet"/>
+      <w:lvlText w:val=""/>
+      <w:lvlJc w:val="left"/>
+      <w:pPr>
+        <w:tabs>
+          <w:tab w:val="num" w:pos="3600"/>
+        </w:tabs>
+        <w:ind w:left="3600" w:hanging="360"/>
+      </w:pPr>
+      <w:rPr>
+        <w:rFonts w:ascii="Wingdings" w:hAnsi="Wingdings" w:hint="default"/>
+        <w:sz w:val="20"/>
+      </w:rPr>
+    </w:lvl>
+    <w:lvl w:ilvl="5" w:tentative="1">
+      <w:start w:val="1"/>
+      <w:numFmt w:val="bullet"/>
+      <w:lvlText w:val=""/>
+      <w:lvlJc w:val="left"/>
+      <w:pPr>
+        <w:tabs>
+          <w:tab w:val="num" w:pos="4320"/>
+        </w:tabs>
+        <w:ind w:left="4320" w:hanging="360"/>
+      </w:pPr>
+      <w:rPr>
+        <w:rFonts w:ascii="Wingdings" w:hAnsi="Wingdings" w:hint="default"/>
+        <w:sz w:val="20"/>
+      </w:rPr>
+    </w:lvl>
+    <w:lvl w:ilvl="6" w:tentative="1">
+      <w:start w:val="1"/>
+      <w:numFmt w:val="bullet"/>
+      <w:lvlText w:val=""/>
+      <w:lvlJc w:val="left"/>
+      <w:pPr>
+        <w:tabs>
+          <w:tab w:val="num" w:pos="5040"/>
+        </w:tabs>
+        <w:ind w:left="5040" w:hanging="360"/>
+      </w:pPr>
+      <w:rPr>
+        <w:rFonts w:ascii="Wingdings" w:hAnsi="Wingdings" w:hint="default"/>
+        <w:sz w:val="20"/>
+      </w:rPr>
+    </w:lvl>
+    <w:lvl w:ilvl="7" w:tentative="1">
+      <w:start w:val="1"/>
+      <w:numFmt w:val="bullet"/>
+      <w:lvlText w:val=""/>
+      <w:lvlJc w:val="left"/>
+      <w:pPr>
+        <w:tabs>
+          <w:tab w:val="num" w:pos="5760"/>
+        </w:tabs>
+        <w:ind w:left="5760" w:hanging="360"/>
+      </w:pPr>
+      <w:rPr>
+        <w:rFonts w:ascii="Wingdings" w:hAnsi="Wingdings" w:hint="default"/>
+        <w:sz w:val="20"/>
+      </w:rPr>
+    </w:lvl>
+    <w:lvl w:ilvl="8" w:tentative="1">
+      <w:start w:val="1"/>
+      <w:numFmt w:val="bullet"/>
+      <w:lvlText w:val=""/>
+      <w:lvlJc w:val="left"/>
+      <w:pPr>
+        <w:tabs>
+          <w:tab w:val="num" w:pos="6480"/>
+        </w:tabs>
+        <w:ind w:left="6480" w:hanging="360"/>
+      </w:pPr>
+      <w:rPr>
+        <w:rFonts w:ascii="Wingdings" w:hAnsi="Wingdings" w:hint="default"/>
+        <w:sz w:val="20"/>
+      </w:rPr>
+    </w:lvl>
+  </w:abstractNum>
+  <w:abstractNum w:abstractNumId="24" w15:restartNumberingAfterBreak="0">
     <w:nsid w:val="479A1190"/>
     <w:multiLevelType w:val="multilevel"/>
     <w:tmpl w:val="CEBEE03E"/>
@@ -5844,7 +8240,7 @@
       </w:rPr>
     </w:lvl>
   </w:abstractNum>
-  <w:abstractNum w:abstractNumId="21" w15:restartNumberingAfterBreak="0">
+  <w:abstractNum w:abstractNumId="25" w15:restartNumberingAfterBreak="0">
     <w:nsid w:val="524D2023"/>
     <w:multiLevelType w:val="multilevel"/>
     <w:tmpl w:val="404CFBFC"/>
@@ -5993,7 +8389,7 @@
       </w:rPr>
     </w:lvl>
   </w:abstractNum>
-  <w:abstractNum w:abstractNumId="22" w15:restartNumberingAfterBreak="0">
+  <w:abstractNum w:abstractNumId="26" w15:restartNumberingAfterBreak="0">
     <w:nsid w:val="544F2060"/>
     <w:multiLevelType w:val="multilevel"/>
     <w:tmpl w:val="99C0EC1C"/>
@@ -6142,7 +8538,7 @@
       </w:rPr>
     </w:lvl>
   </w:abstractNum>
-  <w:abstractNum w:abstractNumId="23" w15:restartNumberingAfterBreak="0">
+  <w:abstractNum w:abstractNumId="27" w15:restartNumberingAfterBreak="0">
     <w:nsid w:val="575B00F6"/>
     <w:multiLevelType w:val="multilevel"/>
     <w:tmpl w:val="33BAE016"/>
@@ -6291,7 +8687,7 @@
       </w:rPr>
     </w:lvl>
   </w:abstractNum>
-  <w:abstractNum w:abstractNumId="24" w15:restartNumberingAfterBreak="0">
+  <w:abstractNum w:abstractNumId="28" w15:restartNumberingAfterBreak="0">
     <w:nsid w:val="5A610C10"/>
     <w:multiLevelType w:val="multilevel"/>
     <w:tmpl w:val="C944B594"/>
@@ -6440,7 +8836,7 @@
       </w:rPr>
     </w:lvl>
   </w:abstractNum>
-  <w:abstractNum w:abstractNumId="25" w15:restartNumberingAfterBreak="0">
+  <w:abstractNum w:abstractNumId="29" w15:restartNumberingAfterBreak="0">
     <w:nsid w:val="5B1332E2"/>
     <w:multiLevelType w:val="multilevel"/>
     <w:tmpl w:val="759A0B34"/>
@@ -6589,7 +8985,7 @@
       </w:rPr>
     </w:lvl>
   </w:abstractNum>
-  <w:abstractNum w:abstractNumId="26" w15:restartNumberingAfterBreak="0">
+  <w:abstractNum w:abstractNumId="30" w15:restartNumberingAfterBreak="0">
     <w:nsid w:val="5DD6256D"/>
     <w:multiLevelType w:val="multilevel"/>
     <w:tmpl w:val="ED708B16"/>
@@ -6738,7 +9134,7 @@
       </w:rPr>
     </w:lvl>
   </w:abstractNum>
-  <w:abstractNum w:abstractNumId="27" w15:restartNumberingAfterBreak="0">
+  <w:abstractNum w:abstractNumId="31" w15:restartNumberingAfterBreak="0">
     <w:nsid w:val="64F30941"/>
     <w:multiLevelType w:val="multilevel"/>
     <w:tmpl w:val="892E22F0"/>
@@ -6887,7 +9283,7 @@
       </w:rPr>
     </w:lvl>
   </w:abstractNum>
-  <w:abstractNum w:abstractNumId="28" w15:restartNumberingAfterBreak="0">
+  <w:abstractNum w:abstractNumId="32" w15:restartNumberingAfterBreak="0">
     <w:nsid w:val="655F2FBD"/>
     <w:multiLevelType w:val="multilevel"/>
     <w:tmpl w:val="32F41674"/>
@@ -7036,7 +9432,7 @@
       </w:rPr>
     </w:lvl>
   </w:abstractNum>
-  <w:abstractNum w:abstractNumId="29" w15:restartNumberingAfterBreak="0">
+  <w:abstractNum w:abstractNumId="33" w15:restartNumberingAfterBreak="0">
     <w:nsid w:val="65E4364B"/>
     <w:multiLevelType w:val="multilevel"/>
     <w:tmpl w:val="2070A96C"/>
@@ -7185,7 +9581,156 @@
       </w:rPr>
     </w:lvl>
   </w:abstractNum>
-  <w:abstractNum w:abstractNumId="30" w15:restartNumberingAfterBreak="0">
+  <w:abstractNum w:abstractNumId="34" w15:restartNumberingAfterBreak="0">
+    <w:nsid w:val="6DDF5D02"/>
+    <w:multiLevelType w:val="multilevel"/>
+    <w:tmpl w:val="BE6A7052"/>
+    <w:lvl w:ilvl="0">
+      <w:start w:val="1"/>
+      <w:numFmt w:val="bullet"/>
+      <w:lvlText w:val=""/>
+      <w:lvlJc w:val="left"/>
+      <w:pPr>
+        <w:tabs>
+          <w:tab w:val="num" w:pos="720"/>
+        </w:tabs>
+        <w:ind w:left="720" w:hanging="360"/>
+      </w:pPr>
+      <w:rPr>
+        <w:rFonts w:ascii="Symbol" w:hAnsi="Symbol" w:hint="default"/>
+        <w:sz w:val="20"/>
+      </w:rPr>
+    </w:lvl>
+    <w:lvl w:ilvl="1" w:tentative="1">
+      <w:start w:val="1"/>
+      <w:numFmt w:val="bullet"/>
+      <w:lvlText w:val="o"/>
+      <w:lvlJc w:val="left"/>
+      <w:pPr>
+        <w:tabs>
+          <w:tab w:val="num" w:pos="1440"/>
+        </w:tabs>
+        <w:ind w:left="1440" w:hanging="360"/>
+      </w:pPr>
+      <w:rPr>
+        <w:rFonts w:ascii="Courier New" w:hAnsi="Courier New" w:hint="default"/>
+        <w:sz w:val="20"/>
+      </w:rPr>
+    </w:lvl>
+    <w:lvl w:ilvl="2" w:tentative="1">
+      <w:start w:val="1"/>
+      <w:numFmt w:val="bullet"/>
+      <w:lvlText w:val=""/>
+      <w:lvlJc w:val="left"/>
+      <w:pPr>
+        <w:tabs>
+          <w:tab w:val="num" w:pos="2160"/>
+        </w:tabs>
+        <w:ind w:left="2160" w:hanging="360"/>
+      </w:pPr>
+      <w:rPr>
+        <w:rFonts w:ascii="Wingdings" w:hAnsi="Wingdings" w:hint="default"/>
+        <w:sz w:val="20"/>
+      </w:rPr>
+    </w:lvl>
+    <w:lvl w:ilvl="3" w:tentative="1">
+      <w:start w:val="1"/>
+      <w:numFmt w:val="bullet"/>
+      <w:lvlText w:val=""/>
+      <w:lvlJc w:val="left"/>
+      <w:pPr>
+        <w:tabs>
+          <w:tab w:val="num" w:pos="2880"/>
+        </w:tabs>
+        <w:ind w:left="2880" w:hanging="360"/>
+      </w:pPr>
+      <w:rPr>
+        <w:rFonts w:ascii="Wingdings" w:hAnsi="Wingdings" w:hint="default"/>
+        <w:sz w:val="20"/>
+      </w:rPr>
+    </w:lvl>
+    <w:lvl w:ilvl="4" w:tentative="1">
+      <w:start w:val="1"/>
+      <w:numFmt w:val="bullet"/>
+      <w:lvlText w:val=""/>
+      <w:lvlJc w:val="left"/>
+      <w:pPr>
+        <w:tabs>
+          <w:tab w:val="num" w:pos="3600"/>
+        </w:tabs>
+        <w:ind w:left="3600" w:hanging="360"/>
+      </w:pPr>
+      <w:rPr>
+        <w:rFonts w:ascii="Wingdings" w:hAnsi="Wingdings" w:hint="default"/>
+        <w:sz w:val="20"/>
+      </w:rPr>
+    </w:lvl>
+    <w:lvl w:ilvl="5" w:tentative="1">
+      <w:start w:val="1"/>
+      <w:numFmt w:val="bullet"/>
+      <w:lvlText w:val=""/>
+      <w:lvlJc w:val="left"/>
+      <w:pPr>
+        <w:tabs>
+          <w:tab w:val="num" w:pos="4320"/>
+        </w:tabs>
+        <w:ind w:left="4320" w:hanging="360"/>
+      </w:pPr>
+      <w:rPr>
+        <w:rFonts w:ascii="Wingdings" w:hAnsi="Wingdings" w:hint="default"/>
+        <w:sz w:val="20"/>
+      </w:rPr>
+    </w:lvl>
+    <w:lvl w:ilvl="6" w:tentative="1">
+      <w:start w:val="1"/>
+      <w:numFmt w:val="bullet"/>
+      <w:lvlText w:val=""/>
+      <w:lvlJc w:val="left"/>
+      <w:pPr>
+        <w:tabs>
+          <w:tab w:val="num" w:pos="5040"/>
+        </w:tabs>
+        <w:ind w:left="5040" w:hanging="360"/>
+      </w:pPr>
+      <w:rPr>
+        <w:rFonts w:ascii="Wingdings" w:hAnsi="Wingdings" w:hint="default"/>
+        <w:sz w:val="20"/>
+      </w:rPr>
+    </w:lvl>
+    <w:lvl w:ilvl="7" w:tentative="1">
+      <w:start w:val="1"/>
+      <w:numFmt w:val="bullet"/>
+      <w:lvlText w:val=""/>
+      <w:lvlJc w:val="left"/>
+      <w:pPr>
+        <w:tabs>
+          <w:tab w:val="num" w:pos="5760"/>
+        </w:tabs>
+        <w:ind w:left="5760" w:hanging="360"/>
+      </w:pPr>
+      <w:rPr>
+        <w:rFonts w:ascii="Wingdings" w:hAnsi="Wingdings" w:hint="default"/>
+        <w:sz w:val="20"/>
+      </w:rPr>
+    </w:lvl>
+    <w:lvl w:ilvl="8" w:tentative="1">
+      <w:start w:val="1"/>
+      <w:numFmt w:val="bullet"/>
+      <w:lvlText w:val=""/>
+      <w:lvlJc w:val="left"/>
+      <w:pPr>
+        <w:tabs>
+          <w:tab w:val="num" w:pos="6480"/>
+        </w:tabs>
+        <w:ind w:left="6480" w:hanging="360"/>
+      </w:pPr>
+      <w:rPr>
+        <w:rFonts w:ascii="Wingdings" w:hAnsi="Wingdings" w:hint="default"/>
+        <w:sz w:val="20"/>
+      </w:rPr>
+    </w:lvl>
+  </w:abstractNum>
+  <w:abstractNum w:abstractNumId="35" w15:restartNumberingAfterBreak="0">
     <w:nsid w:val="6FC64005"/>
     <w:multiLevelType w:val="multilevel"/>
     <w:tmpl w:val="9F7CF6FA"/>
@@ -7334,7 +9879,7 @@
       </w:rPr>
     </w:lvl>
   </w:abstractNum>
-  <w:abstractNum w:abstractNumId="31" w15:restartNumberingAfterBreak="0">
+  <w:abstractNum w:abstractNumId="36" w15:restartNumberingAfterBreak="0">
     <w:nsid w:val="719064F7"/>
     <w:multiLevelType w:val="multilevel"/>
     <w:tmpl w:val="5186E308"/>
@@ -7483,7 +10028,7 @@
       </w:rPr>
     </w:lvl>
   </w:abstractNum>
-  <w:abstractNum w:abstractNumId="32" w15:restartNumberingAfterBreak="0">
+  <w:abstractNum w:abstractNumId="37" w15:restartNumberingAfterBreak="0">
     <w:nsid w:val="72810EA2"/>
     <w:multiLevelType w:val="multilevel"/>
     <w:tmpl w:val="43DEE9E0"/>
@@ -7632,7 +10177,7 @@
       </w:rPr>
     </w:lvl>
   </w:abstractNum>
-  <w:abstractNum w:abstractNumId="33" w15:restartNumberingAfterBreak="0">
+  <w:abstractNum w:abstractNumId="38" w15:restartNumberingAfterBreak="0">
     <w:nsid w:val="79F75493"/>
     <w:multiLevelType w:val="multilevel"/>
     <w:tmpl w:val="C6E0288A"/>
@@ -7781,7 +10326,156 @@
       </w:rPr>
     </w:lvl>
   </w:abstractNum>
-  <w:abstractNum w:abstractNumId="34" w15:restartNumberingAfterBreak="0">
+  <w:abstractNum w:abstractNumId="39" w15:restartNumberingAfterBreak="0">
+    <w:nsid w:val="7CC979DC"/>
+    <w:multiLevelType w:val="multilevel"/>
+    <w:tmpl w:val="A3E4DE06"/>
+    <w:lvl w:ilvl="0">
+      <w:start w:val="1"/>
+      <w:numFmt w:val="bullet"/>
+      <w:lvlText w:val=""/>
+      <w:lvlJc w:val="left"/>
+      <w:pPr>
+        <w:tabs>
+          <w:tab w:val="num" w:pos="720"/>
+        </w:tabs>
+        <w:ind w:left="720" w:hanging="360"/>
+      </w:pPr>
+      <w:rPr>
+        <w:rFonts w:ascii="Symbol" w:hAnsi="Symbol" w:hint="default"/>
+        <w:sz w:val="20"/>
+      </w:rPr>
+    </w:lvl>
+    <w:lvl w:ilvl="1" w:tentative="1">
+      <w:start w:val="1"/>
+      <w:numFmt w:val="bullet"/>
+      <w:lvlText w:val="o"/>
+      <w:lvlJc w:val="left"/>
+      <w:pPr>
+        <w:tabs>
+          <w:tab w:val="num" w:pos="1440"/>
+        </w:tabs>
+        <w:ind w:left="1440" w:hanging="360"/>
+      </w:pPr>
+      <w:rPr>
+        <w:rFonts w:ascii="Courier New" w:hAnsi="Courier New" w:hint="default"/>
+        <w:sz w:val="20"/>
+      </w:rPr>
+    </w:lvl>
+    <w:lvl w:ilvl="2" w:tentative="1">
+      <w:start w:val="1"/>
+      <w:numFmt w:val="bullet"/>
+      <w:lvlText w:val=""/>
+      <w:lvlJc w:val="left"/>
+      <w:pPr>
+        <w:tabs>
+          <w:tab w:val="num" w:pos="2160"/>
+        </w:tabs>
+        <w:ind w:left="2160" w:hanging="360"/>
+      </w:pPr>
+      <w:rPr>
+        <w:rFonts w:ascii="Wingdings" w:hAnsi="Wingdings" w:hint="default"/>
+        <w:sz w:val="20"/>
+      </w:rPr>
+    </w:lvl>
+    <w:lvl w:ilvl="3" w:tentative="1">
+      <w:start w:val="1"/>
+      <w:numFmt w:val="bullet"/>
+      <w:lvlText w:val=""/>
+      <w:lvlJc w:val="left"/>
+      <w:pPr>
+        <w:tabs>
+          <w:tab w:val="num" w:pos="2880"/>
+        </w:tabs>
+        <w:ind w:left="2880" w:hanging="360"/>
+      </w:pPr>
+      <w:rPr>
+        <w:rFonts w:ascii="Wingdings" w:hAnsi="Wingdings" w:hint="default"/>
+        <w:sz w:val="20"/>
+      </w:rPr>
+    </w:lvl>
+    <w:lvl w:ilvl="4" w:tentative="1">
+      <w:start w:val="1"/>
+      <w:numFmt w:val="bullet"/>
+      <w:lvlText w:val=""/>
+      <w:lvlJc w:val="left"/>
+      <w:pPr>
+        <w:tabs>
+          <w:tab w:val="num" w:pos="3600"/>
+        </w:tabs>
+        <w:ind w:left="3600" w:hanging="360"/>
+      </w:pPr>
+      <w:rPr>
+        <w:rFonts w:ascii="Wingdings" w:hAnsi="Wingdings" w:hint="default"/>
+        <w:sz w:val="20"/>
+      </w:rPr>
+    </w:lvl>
+    <w:lvl w:ilvl="5" w:tentative="1">
+      <w:start w:val="1"/>
+      <w:numFmt w:val="bullet"/>
+      <w:lvlText w:val=""/>
+      <w:lvlJc w:val="left"/>
+      <w:pPr>
+        <w:tabs>
+          <w:tab w:val="num" w:pos="4320"/>
+        </w:tabs>
+        <w:ind w:left="4320" w:hanging="360"/>
+      </w:pPr>
+      <w:rPr>
+        <w:rFonts w:ascii="Wingdings" w:hAnsi="Wingdings" w:hint="default"/>
+        <w:sz w:val="20"/>
+      </w:rPr>
+    </w:lvl>
+    <w:lvl w:ilvl="6" w:tentative="1">
+      <w:start w:val="1"/>
+      <w:numFmt w:val="bullet"/>
+      <w:lvlText w:val=""/>
+      <w:lvlJc w:val="left"/>
+      <w:pPr>
+        <w:tabs>
+          <w:tab w:val="num" w:pos="5040"/>
+        </w:tabs>
+        <w:ind w:left="5040" w:hanging="360"/>
+      </w:pPr>
+      <w:rPr>
+        <w:rFonts w:ascii="Wingdings" w:hAnsi="Wingdings" w:hint="default"/>
+        <w:sz w:val="20"/>
+      </w:rPr>
+    </w:lvl>
+    <w:lvl w:ilvl="7" w:tentative="1">
+      <w:start w:val="1"/>
+      <w:numFmt w:val="bullet"/>
+      <w:lvlText w:val=""/>
+      <w:lvlJc w:val="left"/>
+      <w:pPr>
+        <w:tabs>
+          <w:tab w:val="num" w:pos="5760"/>
+        </w:tabs>
+        <w:ind w:left="5760" w:hanging="360"/>
+      </w:pPr>
+      <w:rPr>
+        <w:rFonts w:ascii="Wingdings" w:hAnsi="Wingdings" w:hint="default"/>
+        <w:sz w:val="20"/>
+      </w:rPr>
+    </w:lvl>
+    <w:lvl w:ilvl="8" w:tentative="1">
+      <w:start w:val="1"/>
+      <w:numFmt w:val="bullet"/>
+      <w:lvlText w:val=""/>
+      <w:lvlJc w:val="left"/>
+      <w:pPr>
+        <w:tabs>
+          <w:tab w:val="num" w:pos="6480"/>
+        </w:tabs>
+        <w:ind w:left="6480" w:hanging="360"/>
+      </w:pPr>
+      <w:rPr>
+        <w:rFonts w:ascii="Wingdings" w:hAnsi="Wingdings" w:hint="default"/>
+        <w:sz w:val="20"/>
+      </w:rPr>
+    </w:lvl>
+  </w:abstractNum>
+  <w:abstractNum w:abstractNumId="40" w15:restartNumberingAfterBreak="0">
     <w:nsid w:val="7D993111"/>
     <w:multiLevelType w:val="multilevel"/>
     <w:tmpl w:val="10DC4BFA"/>
@@ -7931,109 +10625,127 @@
     </w:lvl>
   </w:abstractNum>
   <w:num w:numId="1">
-    <w:abstractNumId w:val="29"/>
+    <w:abstractNumId w:val="33"/>
   </w:num>
   <w:num w:numId="2">
     <w:abstractNumId w:val="1"/>
   </w:num>
   <w:num w:numId="3">
-    <w:abstractNumId w:val="21"/>
+    <w:abstractNumId w:val="25"/>
   </w:num>
   <w:num w:numId="4">
-    <w:abstractNumId w:val="20"/>
+    <w:abstractNumId w:val="24"/>
   </w:num>
   <w:num w:numId="5">
-    <w:abstractNumId w:val="8"/>
+    <w:abstractNumId w:val="9"/>
   </w:num>
   <w:num w:numId="6">
-    <w:abstractNumId w:val="28"/>
+    <w:abstractNumId w:val="32"/>
   </w:num>
   <w:num w:numId="7">
-    <w:abstractNumId w:val="15"/>
+    <w:abstractNumId w:val="18"/>
   </w:num>
   <w:num w:numId="8">
     <w:abstractNumId w:val="2"/>
   </w:num>
   <w:num w:numId="9">
-    <w:abstractNumId w:val="23"/>
+    <w:abstractNumId w:val="27"/>
   </w:num>
   <w:num w:numId="10">
-    <w:abstractNumId w:val="13"/>
+    <w:abstractNumId w:val="16"/>
   </w:num>
   <w:num w:numId="11">
     <w:abstractNumId w:val="0"/>
   </w:num>
   <w:num w:numId="12">
-    <w:abstractNumId w:val="30"/>
+    <w:abstractNumId w:val="35"/>
   </w:num>
   <w:num w:numId="13">
-    <w:abstractNumId w:val="14"/>
+    <w:abstractNumId w:val="17"/>
   </w:num>
   <w:num w:numId="14">
     <w:abstractNumId w:val="3"/>
   </w:num>
   <w:num w:numId="15">
-    <w:abstractNumId w:val="27"/>
+    <w:abstractNumId w:val="31"/>
   </w:num>
   <w:num w:numId="16">
-    <w:abstractNumId w:val="22"/>
+    <w:abstractNumId w:val="26"/>
   </w:num>
   <w:num w:numId="17">
-    <w:abstractNumId w:val="18"/>
+    <w:abstractNumId w:val="21"/>
   </w:num>
   <w:num w:numId="18">
-    <w:abstractNumId w:val="32"/>
+    <w:abstractNumId w:val="37"/>
   </w:num>
   <w:num w:numId="19">
-    <w:abstractNumId w:val="34"/>
+    <w:abstractNumId w:val="40"/>
   </w:num>
   <w:num w:numId="20">
-    <w:abstractNumId w:val="11"/>
+    <w:abstractNumId w:val="13"/>
   </w:num>
   <w:num w:numId="21">
     <w:abstractNumId w:val="4"/>
   </w:num>
   <w:num w:numId="22">
+    <w:abstractNumId w:val="22"/>
+  </w:num>
+  <w:num w:numId="23">
+    <w:abstractNumId w:val="20"/>
+  </w:num>
+  <w:num w:numId="24">
     <w:abstractNumId w:val="19"/>
   </w:num>
-  <w:num w:numId="23">
-    <w:abstractNumId w:val="17"/>
+  <w:num w:numId="25">
+    <w:abstractNumId w:val="12"/>
   </w:num>
-  <w:num w:numId="24">
-    <w:abstractNumId w:val="16"/>
+  <w:num w:numId="26">
+    <w:abstractNumId w:val="38"/>
   </w:num>
-  <w:num w:numId="25">
+  <w:num w:numId="27">
+    <w:abstractNumId w:val="30"/>
+  </w:num>
+  <w:num w:numId="28">
+    <w:abstractNumId w:val="7"/>
+  </w:num>
+  <w:num w:numId="29">
+    <w:abstractNumId w:val="6"/>
+  </w:num>
+  <w:num w:numId="30">
+    <w:abstractNumId w:val="8"/>
+  </w:num>
+  <w:num w:numId="31">
+    <w:abstractNumId w:val="36"/>
+  </w:num>
+  <w:num w:numId="32">
+    <w:abstractNumId w:val="15"/>
+  </w:num>
+  <w:num w:numId="33">
+    <w:abstractNumId w:val="29"/>
+  </w:num>
+  <w:num w:numId="34">
+    <w:abstractNumId w:val="11"/>
+  </w:num>
+  <w:num w:numId="35">
+    <w:abstractNumId w:val="28"/>
+  </w:num>
+  <w:num w:numId="36">
     <w:abstractNumId w:val="10"/>
   </w:num>
-  <w:num w:numId="26">
-    <w:abstractNumId w:val="33"/>
+  <w:num w:numId="37">
+    <w:abstractNumId w:val="34"/>
   </w:num>
-  <w:num w:numId="27">
-    <w:abstractNumId w:val="26"/>
+  <w:num w:numId="38">
+    <w:abstractNumId w:val="23"/>
   </w:num>
-  <w:num w:numId="28">
-    <w:abstractNumId w:val="6"/>
-  </w:num>
-  <w:num w:numId="29">
+  <w:num w:numId="39">
     <w:abstractNumId w:val="5"/>
   </w:num>
-  <w:num w:numId="30">
-    <w:abstractNumId w:val="7"/>
+  <w:num w:numId="40">
+    <w:abstractNumId w:val="39"/>
   </w:num>
-  <w:num w:numId="31">
-    <w:abstractNumId w:val="31"/>
-  </w:num>
-  <w:num w:numId="32">
-    <w:abstractNumId w:val="12"/>
-  </w:num>
-  <w:num w:numId="33">
-    <w:abstractNumId w:val="25"/>
-  </w:num>
-  <w:num w:numId="34">
-    <w:abstractNumId w:val="9"/>
-  </w:num>
-  <w:num w:numId="35">
-    <w:abstractNumId w:val="24"/>
+  <w:num w:numId="41">
+    <w:abstractNumId w:val="14"/>
   </w:num>
 </w:numbering>
 </file>
@@ -8437,6 +11149,26 @@
     <w:name w:val="Normal"/>
     <w:qFormat/>
   </w:style>
+  <w:style w:type="paragraph" w:styleId="Ttulo3">
+    <w:name w:val="heading 3"/>
+    <w:basedOn w:val="Normal"/>
+    <w:link w:val="Ttulo3Car"/>
+    <w:uiPriority w:val="9"/>
+    <w:qFormat/>
+    <w:rsid w:val="00832335"/>
+    <w:pPr>
+      <w:spacing w:before="100" w:beforeAutospacing="1" w:after="100" w:afterAutospacing="1" w:line="240" w:lineRule="auto"/>
+      <w:outlineLvl w:val="2"/>
+    </w:pPr>
+    <w:rPr>
+      <w:rFonts w:ascii="Times New Roman" w:eastAsia="Times New Roman" w:hAnsi="Times New Roman" w:cs="Times New Roman"/>
+      <w:b/>
+      <w:bCs/>
+      <w:sz w:val="27"/>
+      <w:szCs w:val="27"/>
+      <w:lang w:eastAsia="es-AR"/>
+    </w:rPr>
+  </w:style>
   <w:style w:type="character" w:default="1" w:styleId="Fuentedeprrafopredeter">
     <w:name w:val="Default Paragraph Font"/>
     <w:uiPriority w:val="1"/>
@@ -8498,6 +11230,21 @@
     <w:name w:val="math-inline"/>
     <w:basedOn w:val="Fuentedeprrafopredeter"/>
     <w:rsid w:val="00533D7A"/>
+  </w:style>
+  <w:style w:type="character" w:customStyle="1" w:styleId="Ttulo3Car">
+    <w:name w:val="Título 3 Car"/>
+    <w:basedOn w:val="Fuentedeprrafopredeter"/>
+    <w:link w:val="Ttulo3"/>
+    <w:uiPriority w:val="9"/>
+    <w:rsid w:val="00832335"/>
+    <w:rPr>
+      <w:rFonts w:ascii="Times New Roman" w:eastAsia="Times New Roman" w:hAnsi="Times New Roman" w:cs="Times New Roman"/>
+      <w:b/>
+      <w:bCs/>
+      <w:sz w:val="27"/>
+      <w:szCs w:val="27"/>
+      <w:lang w:eastAsia="es-AR"/>
+    </w:rPr>
   </w:style>
 </w:styles>
 </file>

</xml_diff>